<commit_message>
Fix Table of Contents word stretching and column alignment
</commit_message>
<xml_diff>
--- a/Internship_Report.docx
+++ b/Internship_Report.docx
@@ -1104,7 +1104,7 @@
           </w:tcPr>
           <w:p>
             <w:pPr>
-              <w:spacing w:after="40" w:line="276" w:lineRule="auto"/>
+              <w:jc w:val="left"/>
             </w:pPr>
             <w:r>
               <w:rPr>
@@ -1112,7 +1112,7 @@
                 <w:b/>
                 <w:sz w:val="22"/>
               </w:rPr>
-              <w:t xml:space="preserve">Chapter No. </w:t>
+              <w:t>Chapter No.</w:t>
             </w:r>
           </w:p>
         </w:tc>
@@ -1128,7 +1128,7 @@
           </w:tcPr>
           <w:p>
             <w:pPr>
-              <w:spacing w:after="40" w:line="276" w:lineRule="auto"/>
+              <w:jc w:val="left"/>
             </w:pPr>
             <w:r>
               <w:rPr>
@@ -1136,7 +1136,7 @@
                 <w:b/>
                 <w:sz w:val="22"/>
               </w:rPr>
-              <w:t xml:space="preserve"> Chapter Name </w:t>
+              <w:t>Chapter Name</w:t>
             </w:r>
           </w:p>
         </w:tc>
@@ -1152,7 +1152,7 @@
           </w:tcPr>
           <w:p>
             <w:pPr>
-              <w:spacing w:after="40" w:line="276" w:lineRule="auto"/>
+              <w:jc w:val="left"/>
             </w:pPr>
             <w:r>
               <w:rPr>
@@ -1160,28 +1160,20 @@
                 <w:b/>
                 <w:sz w:val="22"/>
               </w:rPr>
-              <w:t xml:space="preserve">Page Nos. </w:t>
+              <w:t>Page Nos.</w:t>
             </w:r>
           </w:p>
         </w:tc>
       </w:tr>
       <w:tr>
-        <w:trPr>
-          <w:trHeight w:val="278"/>
-        </w:trPr>
-        <w:tc>
-          <w:tcPr>
-            <w:tcW w:w="1455" w:type="dxa"/>
-            <w:tcBorders>
-              <w:top w:val="single" w:sz="4" w:space="0" w:color="000000"/>
-              <w:left w:val="single" w:sz="4" w:space="0" w:color="000000"/>
-              <w:bottom w:val="single" w:sz="4" w:space="0" w:color="000000"/>
-              <w:right w:val="single" w:sz="4" w:space="0" w:color="000000"/>
-            </w:tcBorders>
-          </w:tcPr>
-          <w:p>
-            <w:pPr>
-              <w:spacing w:after="40" w:line="276" w:lineRule="auto"/>
+        <w:tc>
+          <w:tcPr>
+            <w:tcW w:type="dxa" w:w="1455"/>
+          </w:tcPr>
+          <w:p>
+            <w:pPr>
+              <w:spacing w:before="20" w:after="20" w:line="276" w:lineRule="auto"/>
+              <w:jc w:val="left"/>
             </w:pPr>
             <w:r>
               <w:rPr>
@@ -1193,72 +1185,55 @@
         </w:tc>
         <w:tc>
           <w:tcPr>
-            <w:tcW w:w="4995" w:type="dxa"/>
-            <w:tcBorders>
-              <w:top w:val="single" w:sz="4" w:space="0" w:color="000000"/>
-              <w:left w:val="single" w:sz="4" w:space="0" w:color="000000"/>
-              <w:bottom w:val="single" w:sz="4" w:space="0" w:color="000000"/>
-              <w:right w:val="single" w:sz="4" w:space="0" w:color="000000"/>
-            </w:tcBorders>
-          </w:tcPr>
-          <w:p>
-            <w:pPr>
-              <w:spacing w:after="40" w:line="276" w:lineRule="auto"/>
+            <w:tcW w:type="dxa" w:w="4995"/>
+          </w:tcPr>
+          <w:p>
+            <w:pPr>
+              <w:spacing w:before="20" w:after="20" w:line="276" w:lineRule="auto"/>
+              <w:jc w:val="left"/>
             </w:pPr>
             <w:r>
               <w:rPr>
                 <w:rFonts w:ascii="Times New Roman" w:hAnsi="Times New Roman"/>
                 <w:sz w:val="22"/>
               </w:rPr>
-              <w:t xml:space="preserve">Cover Page </w:t>
-            </w:r>
-          </w:p>
-        </w:tc>
-        <w:tc>
-          <w:tcPr>
-            <w:tcW w:w="1995" w:type="dxa"/>
-            <w:tcBorders>
-              <w:top w:val="single" w:sz="4" w:space="0" w:color="000000"/>
-              <w:left w:val="single" w:sz="4" w:space="0" w:color="000000"/>
-              <w:bottom w:val="single" w:sz="4" w:space="0" w:color="000000"/>
-              <w:right w:val="single" w:sz="4" w:space="0" w:color="000000"/>
-            </w:tcBorders>
-          </w:tcPr>
-          <w:p>
-            <w:pPr>
-              <w:spacing w:after="40" w:line="276" w:lineRule="auto"/>
+              <w:t>Cover Page</w:t>
+            </w:r>
+          </w:p>
+        </w:tc>
+        <w:tc>
+          <w:tcPr>
+            <w:tcW w:type="dxa" w:w="1995"/>
+          </w:tcPr>
+          <w:p>
+            <w:pPr>
+              <w:spacing w:before="20" w:after="20" w:line="276" w:lineRule="auto"/>
+              <w:jc w:val="left"/>
             </w:pPr>
             <w:r>
               <w:rPr>
                 <w:rFonts w:ascii="Times New Roman" w:hAnsi="Times New Roman"/>
                 <w:sz w:val="22"/>
               </w:rPr>
-              <w:t xml:space="preserve">---- </w:t>
+              <w:t>----</w:t>
             </w:r>
           </w:p>
         </w:tc>
       </w:tr>
       <w:tr>
-        <w:trPr>
-          <w:trHeight w:val="278"/>
-        </w:trPr>
-        <w:tc>
-          <w:tcPr>
-            <w:tcW w:w="1455" w:type="dxa"/>
-            <w:tcBorders>
-              <w:top w:val="single" w:sz="4" w:space="0" w:color="000000"/>
-              <w:left w:val="single" w:sz="4" w:space="0" w:color="000000"/>
-              <w:bottom w:val="single" w:sz="4" w:space="0" w:color="000000"/>
-              <w:right w:val="single" w:sz="4" w:space="0" w:color="000000"/>
-            </w:tcBorders>
-          </w:tcPr>
-          <w:p>
-            <w:pPr>
-              <w:spacing w:after="40" w:line="276" w:lineRule="auto"/>
-            </w:pPr>
-            <w:r>
-              <w:rPr>
-                <w:rFonts w:ascii="Times New Roman" w:hAnsi="Times New Roman"/>
+        <w:tc>
+          <w:tcPr>
+            <w:tcW w:type="dxa" w:w="1455"/>
+          </w:tcPr>
+          <w:p>
+            <w:pPr>
+              <w:spacing w:before="20" w:after="20" w:line="276" w:lineRule="auto"/>
+              <w:jc w:val="left"/>
+            </w:pPr>
+            <w:r>
+              <w:rPr>
+                <w:rFonts w:ascii="Times New Roman" w:hAnsi="Times New Roman"/>
+                <w:b/>
                 <w:sz w:val="22"/>
               </w:rPr>
               <w:t>1.</w:t>
@@ -1267,44 +1242,36 @@
         </w:tc>
         <w:tc>
           <w:tcPr>
-            <w:tcW w:w="4995" w:type="dxa"/>
-            <w:tcBorders>
-              <w:top w:val="single" w:sz="4" w:space="0" w:color="000000"/>
-              <w:left w:val="single" w:sz="4" w:space="0" w:color="000000"/>
-              <w:bottom w:val="single" w:sz="4" w:space="0" w:color="000000"/>
-              <w:right w:val="single" w:sz="4" w:space="0" w:color="000000"/>
-            </w:tcBorders>
-          </w:tcPr>
-          <w:p>
-            <w:pPr>
-              <w:spacing w:after="40" w:line="276" w:lineRule="auto"/>
-            </w:pPr>
-            <w:r>
-              <w:rPr>
-                <w:rFonts w:ascii="Times New Roman" w:hAnsi="Times New Roman"/>
+            <w:tcW w:type="dxa" w:w="4995"/>
+          </w:tcPr>
+          <w:p>
+            <w:pPr>
+              <w:spacing w:before="20" w:after="20" w:line="276" w:lineRule="auto"/>
+              <w:jc w:val="left"/>
+            </w:pPr>
+            <w:r>
+              <w:rPr>
+                <w:rFonts w:ascii="Times New Roman" w:hAnsi="Times New Roman"/>
+                <w:b/>
                 <w:sz w:val="22"/>
               </w:rPr>
-              <w:t xml:space="preserve">Candidate’s Declaration </w:t>
-            </w:r>
-          </w:p>
-        </w:tc>
-        <w:tc>
-          <w:tcPr>
-            <w:tcW w:w="1995" w:type="dxa"/>
-            <w:tcBorders>
-              <w:top w:val="single" w:sz="4" w:space="0" w:color="000000"/>
-              <w:left w:val="single" w:sz="4" w:space="0" w:color="000000"/>
-              <w:bottom w:val="single" w:sz="4" w:space="0" w:color="000000"/>
-              <w:right w:val="single" w:sz="4" w:space="0" w:color="000000"/>
-            </w:tcBorders>
-          </w:tcPr>
-          <w:p>
-            <w:pPr>
-              <w:spacing w:after="40" w:line="276" w:lineRule="auto"/>
-            </w:pPr>
-            <w:r>
-              <w:rPr>
-                <w:rFonts w:ascii="Times New Roman" w:hAnsi="Times New Roman"/>
+              <w:t>Candidate’s Declaration</w:t>
+            </w:r>
+          </w:p>
+        </w:tc>
+        <w:tc>
+          <w:tcPr>
+            <w:tcW w:type="dxa" w:w="1995"/>
+          </w:tcPr>
+          <w:p>
+            <w:pPr>
+              <w:spacing w:before="20" w:after="20" w:line="276" w:lineRule="auto"/>
+              <w:jc w:val="left"/>
+            </w:pPr>
+            <w:r>
+              <w:rPr>
+                <w:rFonts w:ascii="Times New Roman" w:hAnsi="Times New Roman"/>
+                <w:b/>
                 <w:sz w:val="22"/>
               </w:rPr>
               <w:t>i</w:t>
@@ -1313,26 +1280,19 @@
         </w:tc>
       </w:tr>
       <w:tr>
-        <w:trPr>
-          <w:trHeight w:val="278"/>
-        </w:trPr>
-        <w:tc>
-          <w:tcPr>
-            <w:tcW w:w="1455" w:type="dxa"/>
-            <w:tcBorders>
-              <w:top w:val="single" w:sz="4" w:space="0" w:color="000000"/>
-              <w:left w:val="single" w:sz="4" w:space="0" w:color="000000"/>
-              <w:bottom w:val="single" w:sz="4" w:space="0" w:color="000000"/>
-              <w:right w:val="single" w:sz="4" w:space="0" w:color="000000"/>
-            </w:tcBorders>
-          </w:tcPr>
-          <w:p>
-            <w:pPr>
-              <w:spacing w:after="40" w:line="276" w:lineRule="auto"/>
-            </w:pPr>
-            <w:r>
-              <w:rPr>
-                <w:rFonts w:ascii="Times New Roman" w:hAnsi="Times New Roman"/>
+        <w:tc>
+          <w:tcPr>
+            <w:tcW w:type="dxa" w:w="1455"/>
+          </w:tcPr>
+          <w:p>
+            <w:pPr>
+              <w:spacing w:before="20" w:after="20" w:line="276" w:lineRule="auto"/>
+              <w:jc w:val="left"/>
+            </w:pPr>
+            <w:r>
+              <w:rPr>
+                <w:rFonts w:ascii="Times New Roman" w:hAnsi="Times New Roman"/>
+                <w:b/>
                 <w:sz w:val="22"/>
               </w:rPr>
               <w:t>2.</w:t>
@@ -1341,44 +1301,36 @@
         </w:tc>
         <w:tc>
           <w:tcPr>
-            <w:tcW w:w="4995" w:type="dxa"/>
-            <w:tcBorders>
-              <w:top w:val="single" w:sz="4" w:space="0" w:color="000000"/>
-              <w:left w:val="single" w:sz="4" w:space="0" w:color="000000"/>
-              <w:bottom w:val="single" w:sz="4" w:space="0" w:color="000000"/>
-              <w:right w:val="single" w:sz="4" w:space="0" w:color="000000"/>
-            </w:tcBorders>
-          </w:tcPr>
-          <w:p>
-            <w:pPr>
-              <w:spacing w:after="40" w:line="276" w:lineRule="auto"/>
-            </w:pPr>
-            <w:r>
-              <w:rPr>
-                <w:rFonts w:ascii="Times New Roman" w:hAnsi="Times New Roman"/>
+            <w:tcW w:type="dxa" w:w="4995"/>
+          </w:tcPr>
+          <w:p>
+            <w:pPr>
+              <w:spacing w:before="20" w:after="20" w:line="276" w:lineRule="auto"/>
+              <w:jc w:val="left"/>
+            </w:pPr>
+            <w:r>
+              <w:rPr>
+                <w:rFonts w:ascii="Times New Roman" w:hAnsi="Times New Roman"/>
+                <w:b/>
                 <w:sz w:val="22"/>
               </w:rPr>
-              <w:t xml:space="preserve">Acknowledgment </w:t>
-            </w:r>
-          </w:p>
-        </w:tc>
-        <w:tc>
-          <w:tcPr>
-            <w:tcW w:w="1995" w:type="dxa"/>
-            <w:tcBorders>
-              <w:top w:val="single" w:sz="4" w:space="0" w:color="000000"/>
-              <w:left w:val="single" w:sz="4" w:space="0" w:color="000000"/>
-              <w:bottom w:val="single" w:sz="4" w:space="0" w:color="000000"/>
-              <w:right w:val="single" w:sz="4" w:space="0" w:color="000000"/>
-            </w:tcBorders>
-          </w:tcPr>
-          <w:p>
-            <w:pPr>
-              <w:spacing w:after="40" w:line="276" w:lineRule="auto"/>
-            </w:pPr>
-            <w:r>
-              <w:rPr>
-                <w:rFonts w:ascii="Times New Roman" w:hAnsi="Times New Roman"/>
+              <w:t>Acknowledgement</w:t>
+            </w:r>
+          </w:p>
+        </w:tc>
+        <w:tc>
+          <w:tcPr>
+            <w:tcW w:type="dxa" w:w="1995"/>
+          </w:tcPr>
+          <w:p>
+            <w:pPr>
+              <w:spacing w:before="20" w:after="20" w:line="276" w:lineRule="auto"/>
+              <w:jc w:val="left"/>
+            </w:pPr>
+            <w:r>
+              <w:rPr>
+                <w:rFonts w:ascii="Times New Roman" w:hAnsi="Times New Roman"/>
+                <w:b/>
                 <w:sz w:val="22"/>
               </w:rPr>
               <w:t>ii</w:t>
@@ -1387,26 +1339,19 @@
         </w:tc>
       </w:tr>
       <w:tr>
-        <w:trPr>
-          <w:trHeight w:val="278"/>
-        </w:trPr>
-        <w:tc>
-          <w:tcPr>
-            <w:tcW w:w="1455" w:type="dxa"/>
-            <w:tcBorders>
-              <w:top w:val="single" w:sz="4" w:space="0" w:color="000000"/>
-              <w:left w:val="single" w:sz="4" w:space="0" w:color="000000"/>
-              <w:bottom w:val="single" w:sz="4" w:space="0" w:color="000000"/>
-              <w:right w:val="single" w:sz="4" w:space="0" w:color="000000"/>
-            </w:tcBorders>
-          </w:tcPr>
-          <w:p>
-            <w:pPr>
-              <w:spacing w:after="40" w:line="276" w:lineRule="auto"/>
-            </w:pPr>
-            <w:r>
-              <w:rPr>
-                <w:rFonts w:ascii="Times New Roman" w:hAnsi="Times New Roman"/>
+        <w:tc>
+          <w:tcPr>
+            <w:tcW w:type="dxa" w:w="1455"/>
+          </w:tcPr>
+          <w:p>
+            <w:pPr>
+              <w:spacing w:before="20" w:after="20" w:line="276" w:lineRule="auto"/>
+              <w:jc w:val="left"/>
+            </w:pPr>
+            <w:r>
+              <w:rPr>
+                <w:rFonts w:ascii="Times New Roman" w:hAnsi="Times New Roman"/>
+                <w:b/>
                 <w:sz w:val="22"/>
               </w:rPr>
               <w:t>3.</w:t>
@@ -1415,21 +1360,17 @@
         </w:tc>
         <w:tc>
           <w:tcPr>
-            <w:tcW w:w="4995" w:type="dxa"/>
-            <w:tcBorders>
-              <w:top w:val="single" w:sz="4" w:space="0" w:color="000000"/>
-              <w:left w:val="single" w:sz="4" w:space="0" w:color="000000"/>
-              <w:bottom w:val="single" w:sz="4" w:space="0" w:color="000000"/>
-              <w:right w:val="single" w:sz="4" w:space="0" w:color="000000"/>
-            </w:tcBorders>
-          </w:tcPr>
-          <w:p>
-            <w:pPr>
-              <w:spacing w:after="40" w:line="276" w:lineRule="auto"/>
-            </w:pPr>
-            <w:r>
-              <w:rPr>
-                <w:rFonts w:ascii="Times New Roman" w:hAnsi="Times New Roman"/>
+            <w:tcW w:type="dxa" w:w="4995"/>
+          </w:tcPr>
+          <w:p>
+            <w:pPr>
+              <w:spacing w:before="20" w:after="20" w:line="276" w:lineRule="auto"/>
+              <w:jc w:val="left"/>
+            </w:pPr>
+            <w:r>
+              <w:rPr>
+                <w:rFonts w:ascii="Times New Roman" w:hAnsi="Times New Roman"/>
+                <w:b/>
                 <w:sz w:val="22"/>
               </w:rPr>
               <w:t>Internship Completion Certificate</w:t>
@@ -1438,21 +1379,17 @@
         </w:tc>
         <w:tc>
           <w:tcPr>
-            <w:tcW w:w="1995" w:type="dxa"/>
-            <w:tcBorders>
-              <w:top w:val="single" w:sz="4" w:space="0" w:color="000000"/>
-              <w:left w:val="single" w:sz="4" w:space="0" w:color="000000"/>
-              <w:bottom w:val="single" w:sz="4" w:space="0" w:color="000000"/>
-              <w:right w:val="single" w:sz="4" w:space="0" w:color="000000"/>
-            </w:tcBorders>
-          </w:tcPr>
-          <w:p>
-            <w:pPr>
-              <w:spacing w:after="40" w:line="276" w:lineRule="auto"/>
-            </w:pPr>
-            <w:r>
-              <w:rPr>
-                <w:rFonts w:ascii="Times New Roman" w:hAnsi="Times New Roman"/>
+            <w:tcW w:type="dxa" w:w="1995"/>
+          </w:tcPr>
+          <w:p>
+            <w:pPr>
+              <w:spacing w:before="20" w:after="20" w:line="276" w:lineRule="auto"/>
+              <w:jc w:val="left"/>
+            </w:pPr>
+            <w:r>
+              <w:rPr>
+                <w:rFonts w:ascii="Times New Roman" w:hAnsi="Times New Roman"/>
+                <w:b/>
                 <w:sz w:val="22"/>
               </w:rPr>
               <w:t>iii</w:t>
@@ -1461,26 +1398,19 @@
         </w:tc>
       </w:tr>
       <w:tr>
-        <w:trPr>
-          <w:trHeight w:val="278"/>
-        </w:trPr>
-        <w:tc>
-          <w:tcPr>
-            <w:tcW w:w="1455" w:type="dxa"/>
-            <w:tcBorders>
-              <w:top w:val="single" w:sz="4" w:space="0" w:color="000000"/>
-              <w:left w:val="single" w:sz="4" w:space="0" w:color="000000"/>
-              <w:bottom w:val="single" w:sz="4" w:space="0" w:color="000000"/>
-              <w:right w:val="single" w:sz="4" w:space="0" w:color="000000"/>
-            </w:tcBorders>
-          </w:tcPr>
-          <w:p>
-            <w:pPr>
-              <w:spacing w:after="40" w:line="276" w:lineRule="auto"/>
-            </w:pPr>
-            <w:r>
-              <w:rPr>
-                <w:rFonts w:ascii="Times New Roman" w:hAnsi="Times New Roman"/>
+        <w:tc>
+          <w:tcPr>
+            <w:tcW w:type="dxa" w:w="1455"/>
+          </w:tcPr>
+          <w:p>
+            <w:pPr>
+              <w:spacing w:before="20" w:after="20" w:line="276" w:lineRule="auto"/>
+              <w:jc w:val="left"/>
+            </w:pPr>
+            <w:r>
+              <w:rPr>
+                <w:rFonts w:ascii="Times New Roman" w:hAnsi="Times New Roman"/>
+                <w:b/>
                 <w:sz w:val="22"/>
               </w:rPr>
               <w:t>4.</w:t>
@@ -1489,64 +1419,36 @@
         </w:tc>
         <w:tc>
           <w:tcPr>
-            <w:tcW w:w="4995" w:type="dxa"/>
-            <w:tcBorders>
-              <w:top w:val="single" w:sz="4" w:space="0" w:color="000000"/>
-              <w:left w:val="single" w:sz="4" w:space="0" w:color="000000"/>
-              <w:bottom w:val="single" w:sz="4" w:space="0" w:color="000000"/>
-              <w:right w:val="single" w:sz="4" w:space="0" w:color="000000"/>
-            </w:tcBorders>
-          </w:tcPr>
-          <w:p>
-            <w:pPr>
-              <w:spacing w:after="40" w:line="276" w:lineRule="auto"/>
-            </w:pPr>
-            <w:r>
-              <w:rPr>
-                <w:rFonts w:ascii="Times New Roman" w:hAnsi="Times New Roman"/>
+            <w:tcW w:type="dxa" w:w="4995"/>
+          </w:tcPr>
+          <w:p>
+            <w:pPr>
+              <w:spacing w:before="20" w:after="20" w:line="276" w:lineRule="auto"/>
+              <w:jc w:val="left"/>
+            </w:pPr>
+            <w:r>
+              <w:rPr>
+                <w:rFonts w:ascii="Times New Roman" w:hAnsi="Times New Roman"/>
+                <w:b/>
                 <w:sz w:val="22"/>
               </w:rPr>
               <w:t>Project Description</w:t>
-              <w:br/>
-              <w:t xml:space="preserve">    4.1 Introduction </w:t>
-              <w:br/>
-              <w:t xml:space="preserve">    4.2 Organization Profile </w:t>
-              <w:br/>
-              <w:t xml:space="preserve">    4.3 Problem Statement </w:t>
-              <w:br/>
-              <w:t xml:space="preserve">    4.4 Project Objectives </w:t>
-              <w:br/>
-              <w:t xml:space="preserve">    4.5 Scope of the Project </w:t>
-              <w:br/>
-              <w:t xml:space="preserve">    4.6 Technologies and Tools Used </w:t>
-              <w:br/>
-              <w:t xml:space="preserve">    4.7 System Architecture </w:t>
-              <w:br/>
-              <w:t xml:space="preserve">    4.8 Methodology </w:t>
-              <w:br/>
-              <w:t xml:space="preserve">    4.9 Expected Outcomes</w:t>
-              <w:br/>
-              <w:t xml:space="preserve">    4.10 Certificates of completion and other communication mail proof must be attached</w:t>
-            </w:r>
-          </w:p>
-        </w:tc>
-        <w:tc>
-          <w:tcPr>
-            <w:tcW w:w="1995" w:type="dxa"/>
-            <w:tcBorders>
-              <w:top w:val="single" w:sz="4" w:space="0" w:color="000000"/>
-              <w:left w:val="single" w:sz="4" w:space="0" w:color="000000"/>
-              <w:bottom w:val="single" w:sz="4" w:space="0" w:color="000000"/>
-              <w:right w:val="single" w:sz="4" w:space="0" w:color="000000"/>
-            </w:tcBorders>
-          </w:tcPr>
-          <w:p>
-            <w:pPr>
-              <w:spacing w:after="40" w:line="276" w:lineRule="auto"/>
-            </w:pPr>
-            <w:r>
-              <w:rPr>
-                <w:rFonts w:ascii="Times New Roman" w:hAnsi="Times New Roman"/>
+            </w:r>
+          </w:p>
+        </w:tc>
+        <w:tc>
+          <w:tcPr>
+            <w:tcW w:type="dxa" w:w="1995"/>
+          </w:tcPr>
+          <w:p>
+            <w:pPr>
+              <w:spacing w:before="20" w:after="20" w:line="276" w:lineRule="auto"/>
+              <w:jc w:val="left"/>
+            </w:pPr>
+            <w:r>
+              <w:rPr>
+                <w:rFonts w:ascii="Times New Roman" w:hAnsi="Times New Roman"/>
+                <w:b/>
                 <w:sz w:val="22"/>
               </w:rPr>
               <w:t>1</w:t>
@@ -1555,49 +1457,578 @@
         </w:tc>
       </w:tr>
       <w:tr>
-        <w:trPr>
-          <w:trHeight w:val="278"/>
-        </w:trPr>
-        <w:tc>
-          <w:tcPr>
-            <w:tcW w:w="1455" w:type="dxa"/>
-            <w:tcBorders>
-              <w:top w:val="single" w:sz="4" w:space="0" w:color="000000"/>
-              <w:left w:val="single" w:sz="4" w:space="0" w:color="000000"/>
-              <w:bottom w:val="single" w:sz="4" w:space="0" w:color="000000"/>
-              <w:right w:val="single" w:sz="4" w:space="0" w:color="000000"/>
-            </w:tcBorders>
-          </w:tcPr>
-          <w:p>
-            <w:pPr>
-              <w:spacing w:after="40" w:line="276" w:lineRule="auto"/>
+        <w:tc>
+          <w:tcPr>
+            <w:tcW w:type="dxa" w:w="1455"/>
+          </w:tcPr>
+          <w:p>
+            <w:pPr>
+              <w:spacing w:before="20" w:after="20" w:line="276" w:lineRule="auto"/>
+              <w:jc w:val="left"/>
             </w:pPr>
             <w:r>
               <w:rPr>
                 <w:rFonts w:ascii="Times New Roman" w:hAnsi="Times New Roman"/>
                 <w:sz w:val="22"/>
               </w:rPr>
+            </w:r>
+          </w:p>
+        </w:tc>
+        <w:tc>
+          <w:tcPr>
+            <w:tcW w:type="dxa" w:w="4995"/>
+          </w:tcPr>
+          <w:p>
+            <w:pPr>
+              <w:spacing w:before="20" w:after="20" w:line="276" w:lineRule="auto"/>
+              <w:jc w:val="left"/>
+            </w:pPr>
+            <w:r>
+              <w:rPr>
+                <w:rFonts w:ascii="Times New Roman" w:hAnsi="Times New Roman"/>
+                <w:sz w:val="22"/>
+              </w:rPr>
+              <w:t xml:space="preserve">    4.1 Introduction</w:t>
+            </w:r>
+          </w:p>
+        </w:tc>
+        <w:tc>
+          <w:tcPr>
+            <w:tcW w:type="dxa" w:w="1995"/>
+          </w:tcPr>
+          <w:p>
+            <w:pPr>
+              <w:spacing w:before="20" w:after="20" w:line="276" w:lineRule="auto"/>
+              <w:jc w:val="left"/>
+            </w:pPr>
+            <w:r>
+              <w:rPr>
+                <w:rFonts w:ascii="Times New Roman" w:hAnsi="Times New Roman"/>
+                <w:sz w:val="22"/>
+              </w:rPr>
+            </w:r>
+          </w:p>
+        </w:tc>
+      </w:tr>
+      <w:tr>
+        <w:tc>
+          <w:tcPr>
+            <w:tcW w:type="dxa" w:w="1455"/>
+          </w:tcPr>
+          <w:p>
+            <w:pPr>
+              <w:spacing w:before="20" w:after="20" w:line="276" w:lineRule="auto"/>
+              <w:jc w:val="left"/>
+            </w:pPr>
+            <w:r>
+              <w:rPr>
+                <w:rFonts w:ascii="Times New Roman" w:hAnsi="Times New Roman"/>
+                <w:sz w:val="22"/>
+              </w:rPr>
+            </w:r>
+          </w:p>
+        </w:tc>
+        <w:tc>
+          <w:tcPr>
+            <w:tcW w:type="dxa" w:w="4995"/>
+          </w:tcPr>
+          <w:p>
+            <w:pPr>
+              <w:spacing w:before="20" w:after="20" w:line="276" w:lineRule="auto"/>
+              <w:jc w:val="left"/>
+            </w:pPr>
+            <w:r>
+              <w:rPr>
+                <w:rFonts w:ascii="Times New Roman" w:hAnsi="Times New Roman"/>
+                <w:sz w:val="22"/>
+              </w:rPr>
+              <w:t xml:space="preserve">    4.2 Organization Profile</w:t>
+            </w:r>
+          </w:p>
+        </w:tc>
+        <w:tc>
+          <w:tcPr>
+            <w:tcW w:type="dxa" w:w="1995"/>
+          </w:tcPr>
+          <w:p>
+            <w:pPr>
+              <w:spacing w:before="20" w:after="20" w:line="276" w:lineRule="auto"/>
+              <w:jc w:val="left"/>
+            </w:pPr>
+            <w:r>
+              <w:rPr>
+                <w:rFonts w:ascii="Times New Roman" w:hAnsi="Times New Roman"/>
+                <w:sz w:val="22"/>
+              </w:rPr>
+            </w:r>
+          </w:p>
+        </w:tc>
+      </w:tr>
+      <w:tr>
+        <w:tc>
+          <w:tcPr>
+            <w:tcW w:type="dxa" w:w="1455"/>
+          </w:tcPr>
+          <w:p>
+            <w:pPr>
+              <w:spacing w:before="20" w:after="20" w:line="276" w:lineRule="auto"/>
+              <w:jc w:val="left"/>
+            </w:pPr>
+            <w:r>
+              <w:rPr>
+                <w:rFonts w:ascii="Times New Roman" w:hAnsi="Times New Roman"/>
+                <w:sz w:val="22"/>
+              </w:rPr>
+            </w:r>
+          </w:p>
+        </w:tc>
+        <w:tc>
+          <w:tcPr>
+            <w:tcW w:type="dxa" w:w="4995"/>
+          </w:tcPr>
+          <w:p>
+            <w:pPr>
+              <w:spacing w:before="20" w:after="20" w:line="276" w:lineRule="auto"/>
+              <w:jc w:val="left"/>
+            </w:pPr>
+            <w:r>
+              <w:rPr>
+                <w:rFonts w:ascii="Times New Roman" w:hAnsi="Times New Roman"/>
+                <w:sz w:val="22"/>
+              </w:rPr>
+              <w:t xml:space="preserve">    4.3 Problem Statement</w:t>
+            </w:r>
+          </w:p>
+        </w:tc>
+        <w:tc>
+          <w:tcPr>
+            <w:tcW w:type="dxa" w:w="1995"/>
+          </w:tcPr>
+          <w:p>
+            <w:pPr>
+              <w:spacing w:before="20" w:after="20" w:line="276" w:lineRule="auto"/>
+              <w:jc w:val="left"/>
+            </w:pPr>
+            <w:r>
+              <w:rPr>
+                <w:rFonts w:ascii="Times New Roman" w:hAnsi="Times New Roman"/>
+                <w:sz w:val="22"/>
+              </w:rPr>
+            </w:r>
+          </w:p>
+        </w:tc>
+      </w:tr>
+      <w:tr>
+        <w:tc>
+          <w:tcPr>
+            <w:tcW w:type="dxa" w:w="1455"/>
+          </w:tcPr>
+          <w:p>
+            <w:pPr>
+              <w:spacing w:before="20" w:after="20" w:line="276" w:lineRule="auto"/>
+              <w:jc w:val="left"/>
+            </w:pPr>
+            <w:r>
+              <w:rPr>
+                <w:rFonts w:ascii="Times New Roman" w:hAnsi="Times New Roman"/>
+                <w:sz w:val="22"/>
+              </w:rPr>
+            </w:r>
+          </w:p>
+        </w:tc>
+        <w:tc>
+          <w:tcPr>
+            <w:tcW w:type="dxa" w:w="4995"/>
+          </w:tcPr>
+          <w:p>
+            <w:pPr>
+              <w:spacing w:before="20" w:after="20" w:line="276" w:lineRule="auto"/>
+              <w:jc w:val="left"/>
+            </w:pPr>
+            <w:r>
+              <w:rPr>
+                <w:rFonts w:ascii="Times New Roman" w:hAnsi="Times New Roman"/>
+                <w:sz w:val="22"/>
+              </w:rPr>
+              <w:t xml:space="preserve">    4.4 Project Objectives</w:t>
+            </w:r>
+          </w:p>
+        </w:tc>
+        <w:tc>
+          <w:tcPr>
+            <w:tcW w:type="dxa" w:w="1995"/>
+          </w:tcPr>
+          <w:p>
+            <w:pPr>
+              <w:spacing w:before="20" w:after="20" w:line="276" w:lineRule="auto"/>
+              <w:jc w:val="left"/>
+            </w:pPr>
+            <w:r>
+              <w:rPr>
+                <w:rFonts w:ascii="Times New Roman" w:hAnsi="Times New Roman"/>
+                <w:sz w:val="22"/>
+              </w:rPr>
+            </w:r>
+          </w:p>
+        </w:tc>
+      </w:tr>
+      <w:tr>
+        <w:tc>
+          <w:tcPr>
+            <w:tcW w:type="dxa" w:w="1455"/>
+          </w:tcPr>
+          <w:p>
+            <w:pPr>
+              <w:spacing w:before="20" w:after="20" w:line="276" w:lineRule="auto"/>
+              <w:jc w:val="left"/>
+            </w:pPr>
+            <w:r>
+              <w:rPr>
+                <w:rFonts w:ascii="Times New Roman" w:hAnsi="Times New Roman"/>
+                <w:sz w:val="22"/>
+              </w:rPr>
+            </w:r>
+          </w:p>
+        </w:tc>
+        <w:tc>
+          <w:tcPr>
+            <w:tcW w:type="dxa" w:w="4995"/>
+          </w:tcPr>
+          <w:p>
+            <w:pPr>
+              <w:spacing w:before="20" w:after="20" w:line="276" w:lineRule="auto"/>
+              <w:jc w:val="left"/>
+            </w:pPr>
+            <w:r>
+              <w:rPr>
+                <w:rFonts w:ascii="Times New Roman" w:hAnsi="Times New Roman"/>
+                <w:sz w:val="22"/>
+              </w:rPr>
+              <w:t xml:space="preserve">    4.5 Scope of the Project</w:t>
+            </w:r>
+          </w:p>
+        </w:tc>
+        <w:tc>
+          <w:tcPr>
+            <w:tcW w:type="dxa" w:w="1995"/>
+          </w:tcPr>
+          <w:p>
+            <w:pPr>
+              <w:spacing w:before="20" w:after="20" w:line="276" w:lineRule="auto"/>
+              <w:jc w:val="left"/>
+            </w:pPr>
+            <w:r>
+              <w:rPr>
+                <w:rFonts w:ascii="Times New Roman" w:hAnsi="Times New Roman"/>
+                <w:sz w:val="22"/>
+              </w:rPr>
+            </w:r>
+          </w:p>
+        </w:tc>
+      </w:tr>
+      <w:tr>
+        <w:tc>
+          <w:tcPr>
+            <w:tcW w:type="dxa" w:w="1455"/>
+          </w:tcPr>
+          <w:p>
+            <w:pPr>
+              <w:spacing w:before="20" w:after="20" w:line="276" w:lineRule="auto"/>
+              <w:jc w:val="left"/>
+            </w:pPr>
+            <w:r>
+              <w:rPr>
+                <w:rFonts w:ascii="Times New Roman" w:hAnsi="Times New Roman"/>
+                <w:sz w:val="22"/>
+              </w:rPr>
+            </w:r>
+          </w:p>
+        </w:tc>
+        <w:tc>
+          <w:tcPr>
+            <w:tcW w:type="dxa" w:w="4995"/>
+          </w:tcPr>
+          <w:p>
+            <w:pPr>
+              <w:spacing w:before="20" w:after="20" w:line="276" w:lineRule="auto"/>
+              <w:jc w:val="left"/>
+            </w:pPr>
+            <w:r>
+              <w:rPr>
+                <w:rFonts w:ascii="Times New Roman" w:hAnsi="Times New Roman"/>
+                <w:sz w:val="22"/>
+              </w:rPr>
+              <w:t xml:space="preserve">    4.6 Technologies and Tools Used</w:t>
+            </w:r>
+          </w:p>
+        </w:tc>
+        <w:tc>
+          <w:tcPr>
+            <w:tcW w:type="dxa" w:w="1995"/>
+          </w:tcPr>
+          <w:p>
+            <w:pPr>
+              <w:spacing w:before="20" w:after="20" w:line="276" w:lineRule="auto"/>
+              <w:jc w:val="left"/>
+            </w:pPr>
+            <w:r>
+              <w:rPr>
+                <w:rFonts w:ascii="Times New Roman" w:hAnsi="Times New Roman"/>
+                <w:sz w:val="22"/>
+              </w:rPr>
+            </w:r>
+          </w:p>
+        </w:tc>
+      </w:tr>
+      <w:tr>
+        <w:tc>
+          <w:tcPr>
+            <w:tcW w:type="dxa" w:w="1455"/>
+          </w:tcPr>
+          <w:p>
+            <w:pPr>
+              <w:spacing w:before="20" w:after="20" w:line="276" w:lineRule="auto"/>
+              <w:jc w:val="left"/>
+            </w:pPr>
+            <w:r>
+              <w:rPr>
+                <w:rFonts w:ascii="Times New Roman" w:hAnsi="Times New Roman"/>
+                <w:sz w:val="22"/>
+              </w:rPr>
+            </w:r>
+          </w:p>
+        </w:tc>
+        <w:tc>
+          <w:tcPr>
+            <w:tcW w:type="dxa" w:w="4995"/>
+          </w:tcPr>
+          <w:p>
+            <w:pPr>
+              <w:spacing w:before="20" w:after="20" w:line="276" w:lineRule="auto"/>
+              <w:jc w:val="left"/>
+            </w:pPr>
+            <w:r>
+              <w:rPr>
+                <w:rFonts w:ascii="Times New Roman" w:hAnsi="Times New Roman"/>
+                <w:sz w:val="22"/>
+              </w:rPr>
+              <w:t xml:space="preserve">    4.7 System Architecture</w:t>
+            </w:r>
+          </w:p>
+        </w:tc>
+        <w:tc>
+          <w:tcPr>
+            <w:tcW w:type="dxa" w:w="1995"/>
+          </w:tcPr>
+          <w:p>
+            <w:pPr>
+              <w:spacing w:before="20" w:after="20" w:line="276" w:lineRule="auto"/>
+              <w:jc w:val="left"/>
+            </w:pPr>
+            <w:r>
+              <w:rPr>
+                <w:rFonts w:ascii="Times New Roman" w:hAnsi="Times New Roman"/>
+                <w:sz w:val="22"/>
+              </w:rPr>
+            </w:r>
+          </w:p>
+        </w:tc>
+      </w:tr>
+      <w:tr>
+        <w:tc>
+          <w:tcPr>
+            <w:tcW w:type="dxa" w:w="1455"/>
+          </w:tcPr>
+          <w:p>
+            <w:pPr>
+              <w:spacing w:before="20" w:after="20" w:line="276" w:lineRule="auto"/>
+              <w:jc w:val="left"/>
+            </w:pPr>
+            <w:r>
+              <w:rPr>
+                <w:rFonts w:ascii="Times New Roman" w:hAnsi="Times New Roman"/>
+                <w:sz w:val="22"/>
+              </w:rPr>
+            </w:r>
+          </w:p>
+        </w:tc>
+        <w:tc>
+          <w:tcPr>
+            <w:tcW w:type="dxa" w:w="4995"/>
+          </w:tcPr>
+          <w:p>
+            <w:pPr>
+              <w:spacing w:before="20" w:after="20" w:line="276" w:lineRule="auto"/>
+              <w:jc w:val="left"/>
+            </w:pPr>
+            <w:r>
+              <w:rPr>
+                <w:rFonts w:ascii="Times New Roman" w:hAnsi="Times New Roman"/>
+                <w:sz w:val="22"/>
+              </w:rPr>
+              <w:t xml:space="preserve">    4.8 Methodology</w:t>
+            </w:r>
+          </w:p>
+        </w:tc>
+        <w:tc>
+          <w:tcPr>
+            <w:tcW w:type="dxa" w:w="1995"/>
+          </w:tcPr>
+          <w:p>
+            <w:pPr>
+              <w:spacing w:before="20" w:after="20" w:line="276" w:lineRule="auto"/>
+              <w:jc w:val="left"/>
+            </w:pPr>
+            <w:r>
+              <w:rPr>
+                <w:rFonts w:ascii="Times New Roman" w:hAnsi="Times New Roman"/>
+                <w:sz w:val="22"/>
+              </w:rPr>
+            </w:r>
+          </w:p>
+        </w:tc>
+      </w:tr>
+      <w:tr>
+        <w:tc>
+          <w:tcPr>
+            <w:tcW w:type="dxa" w:w="1455"/>
+          </w:tcPr>
+          <w:p>
+            <w:pPr>
+              <w:spacing w:before="20" w:after="20" w:line="276" w:lineRule="auto"/>
+              <w:jc w:val="left"/>
+            </w:pPr>
+            <w:r>
+              <w:rPr>
+                <w:rFonts w:ascii="Times New Roman" w:hAnsi="Times New Roman"/>
+                <w:sz w:val="22"/>
+              </w:rPr>
+            </w:r>
+          </w:p>
+        </w:tc>
+        <w:tc>
+          <w:tcPr>
+            <w:tcW w:type="dxa" w:w="4995"/>
+          </w:tcPr>
+          <w:p>
+            <w:pPr>
+              <w:spacing w:before="20" w:after="20" w:line="276" w:lineRule="auto"/>
+              <w:jc w:val="left"/>
+            </w:pPr>
+            <w:r>
+              <w:rPr>
+                <w:rFonts w:ascii="Times New Roman" w:hAnsi="Times New Roman"/>
+                <w:sz w:val="22"/>
+              </w:rPr>
+              <w:t xml:space="preserve">    4.9 Expected Outcomes</w:t>
+            </w:r>
+          </w:p>
+        </w:tc>
+        <w:tc>
+          <w:tcPr>
+            <w:tcW w:type="dxa" w:w="1995"/>
+          </w:tcPr>
+          <w:p>
+            <w:pPr>
+              <w:spacing w:before="20" w:after="20" w:line="276" w:lineRule="auto"/>
+              <w:jc w:val="left"/>
+            </w:pPr>
+            <w:r>
+              <w:rPr>
+                <w:rFonts w:ascii="Times New Roman" w:hAnsi="Times New Roman"/>
+                <w:sz w:val="22"/>
+              </w:rPr>
+            </w:r>
+          </w:p>
+        </w:tc>
+      </w:tr>
+      <w:tr>
+        <w:tc>
+          <w:tcPr>
+            <w:tcW w:type="dxa" w:w="1455"/>
+          </w:tcPr>
+          <w:p>
+            <w:pPr>
+              <w:spacing w:before="20" w:after="20" w:line="276" w:lineRule="auto"/>
+              <w:jc w:val="left"/>
+            </w:pPr>
+            <w:r>
+              <w:rPr>
+                <w:rFonts w:ascii="Times New Roman" w:hAnsi="Times New Roman"/>
+                <w:sz w:val="22"/>
+              </w:rPr>
+            </w:r>
+          </w:p>
+        </w:tc>
+        <w:tc>
+          <w:tcPr>
+            <w:tcW w:type="dxa" w:w="4995"/>
+          </w:tcPr>
+          <w:p>
+            <w:pPr>
+              <w:spacing w:before="20" w:after="20" w:line="276" w:lineRule="auto"/>
+              <w:jc w:val="left"/>
+            </w:pPr>
+            <w:r>
+              <w:rPr>
+                <w:rFonts w:ascii="Times New Roman" w:hAnsi="Times New Roman"/>
+                <w:sz w:val="22"/>
+              </w:rPr>
+              <w:t xml:space="preserve">    4.10 Certificates of Completion &amp; Communication Proof</w:t>
+            </w:r>
+          </w:p>
+        </w:tc>
+        <w:tc>
+          <w:tcPr>
+            <w:tcW w:type="dxa" w:w="1995"/>
+          </w:tcPr>
+          <w:p>
+            <w:pPr>
+              <w:spacing w:before="20" w:after="20" w:line="276" w:lineRule="auto"/>
+              <w:jc w:val="left"/>
+            </w:pPr>
+            <w:r>
+              <w:rPr>
+                <w:rFonts w:ascii="Times New Roman" w:hAnsi="Times New Roman"/>
+                <w:sz w:val="22"/>
+              </w:rPr>
+            </w:r>
+          </w:p>
+        </w:tc>
+      </w:tr>
+      <w:tr>
+        <w:tc>
+          <w:tcPr>
+            <w:tcW w:type="dxa" w:w="1455"/>
+          </w:tcPr>
+          <w:p>
+            <w:pPr>
+              <w:spacing w:before="20" w:after="20" w:line="276" w:lineRule="auto"/>
+              <w:jc w:val="left"/>
+            </w:pPr>
+            <w:r>
+              <w:rPr>
+                <w:rFonts w:ascii="Times New Roman" w:hAnsi="Times New Roman"/>
+                <w:b/>
+                <w:sz w:val="22"/>
+              </w:rPr>
               <w:t>5.</w:t>
             </w:r>
           </w:p>
         </w:tc>
         <w:tc>
           <w:tcPr>
-            <w:tcW w:w="4995" w:type="dxa"/>
-            <w:tcBorders>
-              <w:top w:val="single" w:sz="4" w:space="0" w:color="000000"/>
-              <w:left w:val="single" w:sz="4" w:space="0" w:color="000000"/>
-              <w:bottom w:val="single" w:sz="4" w:space="0" w:color="000000"/>
-              <w:right w:val="single" w:sz="4" w:space="0" w:color="000000"/>
-            </w:tcBorders>
-          </w:tcPr>
-          <w:p>
-            <w:pPr>
-              <w:spacing w:after="40" w:line="276" w:lineRule="auto"/>
-            </w:pPr>
-            <w:r>
-              <w:rPr>
-                <w:rFonts w:ascii="Times New Roman" w:hAnsi="Times New Roman"/>
+            <w:tcW w:type="dxa" w:w="4995"/>
+          </w:tcPr>
+          <w:p>
+            <w:pPr>
+              <w:spacing w:before="20" w:after="20" w:line="276" w:lineRule="auto"/>
+              <w:jc w:val="left"/>
+            </w:pPr>
+            <w:r>
+              <w:rPr>
+                <w:rFonts w:ascii="Times New Roman" w:hAnsi="Times New Roman"/>
+                <w:b/>
                 <w:sz w:val="22"/>
               </w:rPr>
               <w:t>Bibliography / References</w:t>
@@ -1606,21 +2037,17 @@
         </w:tc>
         <w:tc>
           <w:tcPr>
-            <w:tcW w:w="1995" w:type="dxa"/>
-            <w:tcBorders>
-              <w:top w:val="single" w:sz="4" w:space="0" w:color="000000"/>
-              <w:left w:val="single" w:sz="4" w:space="0" w:color="000000"/>
-              <w:bottom w:val="single" w:sz="4" w:space="0" w:color="000000"/>
-              <w:right w:val="single" w:sz="4" w:space="0" w:color="000000"/>
-            </w:tcBorders>
-          </w:tcPr>
-          <w:p>
-            <w:pPr>
-              <w:spacing w:after="40" w:line="276" w:lineRule="auto"/>
-            </w:pPr>
-            <w:r>
-              <w:rPr>
-                <w:rFonts w:ascii="Times New Roman" w:hAnsi="Times New Roman"/>
+            <w:tcW w:type="dxa" w:w="1995"/>
+          </w:tcPr>
+          <w:p>
+            <w:pPr>
+              <w:spacing w:before="20" w:after="20" w:line="276" w:lineRule="auto"/>
+              <w:jc w:val="left"/>
+            </w:pPr>
+            <w:r>
+              <w:rPr>
+                <w:rFonts w:ascii="Times New Roman" w:hAnsi="Times New Roman"/>
+                <w:b/>
                 <w:sz w:val="22"/>
               </w:rPr>
               <w:t>14</w:t>

</xml_diff>

<commit_message>
Restore original single-box Table 0 style with left alignment fix
</commit_message>
<xml_diff>
--- a/Internship_Report.docx
+++ b/Internship_Report.docx
@@ -1104,6 +1104,7 @@
           </w:tcPr>
           <w:p>
             <w:pPr>
+              <w:spacing w:line="276" w:lineRule="auto" w:before="40" w:after="40"/>
               <w:jc w:val="left"/>
             </w:pPr>
             <w:r>
@@ -1112,7 +1113,7 @@
                 <w:b/>
                 <w:sz w:val="22"/>
               </w:rPr>
-              <w:t>Chapter No.</w:t>
+              <w:t xml:space="preserve">Chapter No. </w:t>
             </w:r>
           </w:p>
         </w:tc>
@@ -1128,6 +1129,7 @@
           </w:tcPr>
           <w:p>
             <w:pPr>
+              <w:spacing w:line="276" w:lineRule="auto" w:before="40" w:after="40"/>
               <w:jc w:val="left"/>
             </w:pPr>
             <w:r>
@@ -1136,7 +1138,7 @@
                 <w:b/>
                 <w:sz w:val="22"/>
               </w:rPr>
-              <w:t>Chapter Name</w:t>
+              <w:t xml:space="preserve"> Chapter Name </w:t>
             </w:r>
           </w:p>
         </w:tc>
@@ -1152,6 +1154,7 @@
           </w:tcPr>
           <w:p>
             <w:pPr>
+              <w:spacing w:line="276" w:lineRule="auto" w:before="40" w:after="40"/>
               <w:jc w:val="left"/>
             </w:pPr>
             <w:r>
@@ -1160,19 +1163,28 @@
                 <w:b/>
                 <w:sz w:val="22"/>
               </w:rPr>
-              <w:t>Page Nos.</w:t>
+              <w:t xml:space="preserve">Page Nos. </w:t>
             </w:r>
           </w:p>
         </w:tc>
       </w:tr>
       <w:tr>
+        <w:trPr>
+          <w:trHeight w:val="278"/>
+        </w:trPr>
         <w:tc>
           <w:tcPr>
-            <w:tcW w:type="dxa" w:w="1455"/>
+            <w:tcW w:w="1455" w:type="dxa"/>
+            <w:tcBorders>
+              <w:top w:val="single" w:sz="4" w:space="0" w:color="000000"/>
+              <w:left w:val="single" w:sz="4" w:space="0" w:color="000000"/>
+              <w:bottom w:val="single" w:sz="4" w:space="0" w:color="000000"/>
+              <w:right w:val="single" w:sz="4" w:space="0" w:color="000000"/>
+            </w:tcBorders>
           </w:tcPr>
           <w:p>
             <w:pPr>
-              <w:spacing w:before="20" w:after="20" w:line="276" w:lineRule="auto"/>
+              <w:spacing w:line="276" w:lineRule="auto" w:before="40" w:after="40"/>
               <w:jc w:val="left"/>
             </w:pPr>
             <w:r>
@@ -1185,11 +1197,17 @@
         </w:tc>
         <w:tc>
           <w:tcPr>
-            <w:tcW w:type="dxa" w:w="4995"/>
+            <w:tcW w:w="4995" w:type="dxa"/>
+            <w:tcBorders>
+              <w:top w:val="single" w:sz="4" w:space="0" w:color="000000"/>
+              <w:left w:val="single" w:sz="4" w:space="0" w:color="000000"/>
+              <w:bottom w:val="single" w:sz="4" w:space="0" w:color="000000"/>
+              <w:right w:val="single" w:sz="4" w:space="0" w:color="000000"/>
+            </w:tcBorders>
           </w:tcPr>
           <w:p>
             <w:pPr>
-              <w:spacing w:before="20" w:after="20" w:line="276" w:lineRule="auto"/>
+              <w:spacing w:line="276" w:lineRule="auto" w:before="40" w:after="40"/>
               <w:jc w:val="left"/>
             </w:pPr>
             <w:r>
@@ -1197,17 +1215,23 @@
                 <w:rFonts w:ascii="Times New Roman" w:hAnsi="Times New Roman"/>
                 <w:sz w:val="22"/>
               </w:rPr>
-              <w:t>Cover Page</w:t>
+              <w:t xml:space="preserve">Cover Page </w:t>
             </w:r>
           </w:p>
         </w:tc>
         <w:tc>
           <w:tcPr>
-            <w:tcW w:type="dxa" w:w="1995"/>
+            <w:tcW w:w="1995" w:type="dxa"/>
+            <w:tcBorders>
+              <w:top w:val="single" w:sz="4" w:space="0" w:color="000000"/>
+              <w:left w:val="single" w:sz="4" w:space="0" w:color="000000"/>
+              <w:bottom w:val="single" w:sz="4" w:space="0" w:color="000000"/>
+              <w:right w:val="single" w:sz="4" w:space="0" w:color="000000"/>
+            </w:tcBorders>
           </w:tcPr>
           <w:p>
             <w:pPr>
-              <w:spacing w:before="20" w:after="20" w:line="276" w:lineRule="auto"/>
+              <w:spacing w:line="276" w:lineRule="auto" w:before="40" w:after="40"/>
               <w:jc w:val="left"/>
             </w:pPr>
             <w:r>
@@ -1215,25 +1239,33 @@
                 <w:rFonts w:ascii="Times New Roman" w:hAnsi="Times New Roman"/>
                 <w:sz w:val="22"/>
               </w:rPr>
-              <w:t>----</w:t>
+              <w:t xml:space="preserve">---- </w:t>
             </w:r>
           </w:p>
         </w:tc>
       </w:tr>
       <w:tr>
+        <w:trPr>
+          <w:trHeight w:val="278"/>
+        </w:trPr>
         <w:tc>
           <w:tcPr>
-            <w:tcW w:type="dxa" w:w="1455"/>
+            <w:tcW w:w="1455" w:type="dxa"/>
+            <w:tcBorders>
+              <w:top w:val="single" w:sz="4" w:space="0" w:color="000000"/>
+              <w:left w:val="single" w:sz="4" w:space="0" w:color="000000"/>
+              <w:bottom w:val="single" w:sz="4" w:space="0" w:color="000000"/>
+              <w:right w:val="single" w:sz="4" w:space="0" w:color="000000"/>
+            </w:tcBorders>
           </w:tcPr>
           <w:p>
             <w:pPr>
-              <w:spacing w:before="20" w:after="20" w:line="276" w:lineRule="auto"/>
+              <w:spacing w:line="276" w:lineRule="auto" w:before="40" w:after="40"/>
               <w:jc w:val="left"/>
             </w:pPr>
             <w:r>
               <w:rPr>
                 <w:rFonts w:ascii="Times New Roman" w:hAnsi="Times New Roman"/>
-                <w:b/>
                 <w:sz w:val="22"/>
               </w:rPr>
               <w:t>1.</w:t>
@@ -1242,36 +1274,46 @@
         </w:tc>
         <w:tc>
           <w:tcPr>
-            <w:tcW w:type="dxa" w:w="4995"/>
+            <w:tcW w:w="4995" w:type="dxa"/>
+            <w:tcBorders>
+              <w:top w:val="single" w:sz="4" w:space="0" w:color="000000"/>
+              <w:left w:val="single" w:sz="4" w:space="0" w:color="000000"/>
+              <w:bottom w:val="single" w:sz="4" w:space="0" w:color="000000"/>
+              <w:right w:val="single" w:sz="4" w:space="0" w:color="000000"/>
+            </w:tcBorders>
           </w:tcPr>
           <w:p>
             <w:pPr>
-              <w:spacing w:before="20" w:after="20" w:line="276" w:lineRule="auto"/>
+              <w:spacing w:line="276" w:lineRule="auto" w:before="40" w:after="40"/>
               <w:jc w:val="left"/>
             </w:pPr>
             <w:r>
               <w:rPr>
                 <w:rFonts w:ascii="Times New Roman" w:hAnsi="Times New Roman"/>
-                <w:b/>
                 <w:sz w:val="22"/>
               </w:rPr>
-              <w:t>Candidate’s Declaration</w:t>
+              <w:t xml:space="preserve">Candidate’s Declaration </w:t>
             </w:r>
           </w:p>
         </w:tc>
         <w:tc>
           <w:tcPr>
-            <w:tcW w:type="dxa" w:w="1995"/>
+            <w:tcW w:w="1995" w:type="dxa"/>
+            <w:tcBorders>
+              <w:top w:val="single" w:sz="4" w:space="0" w:color="000000"/>
+              <w:left w:val="single" w:sz="4" w:space="0" w:color="000000"/>
+              <w:bottom w:val="single" w:sz="4" w:space="0" w:color="000000"/>
+              <w:right w:val="single" w:sz="4" w:space="0" w:color="000000"/>
+            </w:tcBorders>
           </w:tcPr>
           <w:p>
             <w:pPr>
-              <w:spacing w:before="20" w:after="20" w:line="276" w:lineRule="auto"/>
+              <w:spacing w:line="276" w:lineRule="auto" w:before="40" w:after="40"/>
               <w:jc w:val="left"/>
             </w:pPr>
             <w:r>
               <w:rPr>
                 <w:rFonts w:ascii="Times New Roman" w:hAnsi="Times New Roman"/>
-                <w:b/>
                 <w:sz w:val="22"/>
               </w:rPr>
               <w:t>i</w:t>
@@ -1280,19 +1322,27 @@
         </w:tc>
       </w:tr>
       <w:tr>
+        <w:trPr>
+          <w:trHeight w:val="278"/>
+        </w:trPr>
         <w:tc>
           <w:tcPr>
-            <w:tcW w:type="dxa" w:w="1455"/>
+            <w:tcW w:w="1455" w:type="dxa"/>
+            <w:tcBorders>
+              <w:top w:val="single" w:sz="4" w:space="0" w:color="000000"/>
+              <w:left w:val="single" w:sz="4" w:space="0" w:color="000000"/>
+              <w:bottom w:val="single" w:sz="4" w:space="0" w:color="000000"/>
+              <w:right w:val="single" w:sz="4" w:space="0" w:color="000000"/>
+            </w:tcBorders>
           </w:tcPr>
           <w:p>
             <w:pPr>
-              <w:spacing w:before="20" w:after="20" w:line="276" w:lineRule="auto"/>
+              <w:spacing w:line="276" w:lineRule="auto" w:before="40" w:after="40"/>
               <w:jc w:val="left"/>
             </w:pPr>
             <w:r>
               <w:rPr>
                 <w:rFonts w:ascii="Times New Roman" w:hAnsi="Times New Roman"/>
-                <w:b/>
                 <w:sz w:val="22"/>
               </w:rPr>
               <w:t>2.</w:t>
@@ -1301,36 +1351,46 @@
         </w:tc>
         <w:tc>
           <w:tcPr>
-            <w:tcW w:type="dxa" w:w="4995"/>
+            <w:tcW w:w="4995" w:type="dxa"/>
+            <w:tcBorders>
+              <w:top w:val="single" w:sz="4" w:space="0" w:color="000000"/>
+              <w:left w:val="single" w:sz="4" w:space="0" w:color="000000"/>
+              <w:bottom w:val="single" w:sz="4" w:space="0" w:color="000000"/>
+              <w:right w:val="single" w:sz="4" w:space="0" w:color="000000"/>
+            </w:tcBorders>
           </w:tcPr>
           <w:p>
             <w:pPr>
-              <w:spacing w:before="20" w:after="20" w:line="276" w:lineRule="auto"/>
+              <w:spacing w:line="276" w:lineRule="auto" w:before="40" w:after="40"/>
               <w:jc w:val="left"/>
             </w:pPr>
             <w:r>
               <w:rPr>
                 <w:rFonts w:ascii="Times New Roman" w:hAnsi="Times New Roman"/>
-                <w:b/>
                 <w:sz w:val="22"/>
               </w:rPr>
-              <w:t>Acknowledgement</w:t>
+              <w:t xml:space="preserve">Acknowledgment </w:t>
             </w:r>
           </w:p>
         </w:tc>
         <w:tc>
           <w:tcPr>
-            <w:tcW w:type="dxa" w:w="1995"/>
+            <w:tcW w:w="1995" w:type="dxa"/>
+            <w:tcBorders>
+              <w:top w:val="single" w:sz="4" w:space="0" w:color="000000"/>
+              <w:left w:val="single" w:sz="4" w:space="0" w:color="000000"/>
+              <w:bottom w:val="single" w:sz="4" w:space="0" w:color="000000"/>
+              <w:right w:val="single" w:sz="4" w:space="0" w:color="000000"/>
+            </w:tcBorders>
           </w:tcPr>
           <w:p>
             <w:pPr>
-              <w:spacing w:before="20" w:after="20" w:line="276" w:lineRule="auto"/>
+              <w:spacing w:line="276" w:lineRule="auto" w:before="40" w:after="40"/>
               <w:jc w:val="left"/>
             </w:pPr>
             <w:r>
               <w:rPr>
                 <w:rFonts w:ascii="Times New Roman" w:hAnsi="Times New Roman"/>
-                <w:b/>
                 <w:sz w:val="22"/>
               </w:rPr>
               <w:t>ii</w:t>
@@ -1339,19 +1399,27 @@
         </w:tc>
       </w:tr>
       <w:tr>
+        <w:trPr>
+          <w:trHeight w:val="278"/>
+        </w:trPr>
         <w:tc>
           <w:tcPr>
-            <w:tcW w:type="dxa" w:w="1455"/>
+            <w:tcW w:w="1455" w:type="dxa"/>
+            <w:tcBorders>
+              <w:top w:val="single" w:sz="4" w:space="0" w:color="000000"/>
+              <w:left w:val="single" w:sz="4" w:space="0" w:color="000000"/>
+              <w:bottom w:val="single" w:sz="4" w:space="0" w:color="000000"/>
+              <w:right w:val="single" w:sz="4" w:space="0" w:color="000000"/>
+            </w:tcBorders>
           </w:tcPr>
           <w:p>
             <w:pPr>
-              <w:spacing w:before="20" w:after="20" w:line="276" w:lineRule="auto"/>
+              <w:spacing w:line="276" w:lineRule="auto" w:before="40" w:after="40"/>
               <w:jc w:val="left"/>
             </w:pPr>
             <w:r>
               <w:rPr>
                 <w:rFonts w:ascii="Times New Roman" w:hAnsi="Times New Roman"/>
-                <w:b/>
                 <w:sz w:val="22"/>
               </w:rPr>
               <w:t>3.</w:t>
@@ -1360,17 +1428,22 @@
         </w:tc>
         <w:tc>
           <w:tcPr>
-            <w:tcW w:type="dxa" w:w="4995"/>
+            <w:tcW w:w="4995" w:type="dxa"/>
+            <w:tcBorders>
+              <w:top w:val="single" w:sz="4" w:space="0" w:color="000000"/>
+              <w:left w:val="single" w:sz="4" w:space="0" w:color="000000"/>
+              <w:bottom w:val="single" w:sz="4" w:space="0" w:color="000000"/>
+              <w:right w:val="single" w:sz="4" w:space="0" w:color="000000"/>
+            </w:tcBorders>
           </w:tcPr>
           <w:p>
             <w:pPr>
-              <w:spacing w:before="20" w:after="20" w:line="276" w:lineRule="auto"/>
+              <w:spacing w:line="276" w:lineRule="auto" w:before="40" w:after="40"/>
               <w:jc w:val="left"/>
             </w:pPr>
             <w:r>
               <w:rPr>
                 <w:rFonts w:ascii="Times New Roman" w:hAnsi="Times New Roman"/>
-                <w:b/>
                 <w:sz w:val="22"/>
               </w:rPr>
               <w:t>Internship Completion Certificate</w:t>
@@ -1379,17 +1452,22 @@
         </w:tc>
         <w:tc>
           <w:tcPr>
-            <w:tcW w:type="dxa" w:w="1995"/>
+            <w:tcW w:w="1995" w:type="dxa"/>
+            <w:tcBorders>
+              <w:top w:val="single" w:sz="4" w:space="0" w:color="000000"/>
+              <w:left w:val="single" w:sz="4" w:space="0" w:color="000000"/>
+              <w:bottom w:val="single" w:sz="4" w:space="0" w:color="000000"/>
+              <w:right w:val="single" w:sz="4" w:space="0" w:color="000000"/>
+            </w:tcBorders>
           </w:tcPr>
           <w:p>
             <w:pPr>
-              <w:spacing w:before="20" w:after="20" w:line="276" w:lineRule="auto"/>
+              <w:spacing w:line="276" w:lineRule="auto" w:before="40" w:after="40"/>
               <w:jc w:val="left"/>
             </w:pPr>
             <w:r>
               <w:rPr>
                 <w:rFonts w:ascii="Times New Roman" w:hAnsi="Times New Roman"/>
-                <w:b/>
                 <w:sz w:val="22"/>
               </w:rPr>
               <w:t>iii</w:t>
@@ -1398,19 +1476,27 @@
         </w:tc>
       </w:tr>
       <w:tr>
+        <w:trPr>
+          <w:trHeight w:val="278"/>
+        </w:trPr>
         <w:tc>
           <w:tcPr>
-            <w:tcW w:type="dxa" w:w="1455"/>
+            <w:tcW w:w="1455" w:type="dxa"/>
+            <w:tcBorders>
+              <w:top w:val="single" w:sz="4" w:space="0" w:color="000000"/>
+              <w:left w:val="single" w:sz="4" w:space="0" w:color="000000"/>
+              <w:bottom w:val="single" w:sz="4" w:space="0" w:color="000000"/>
+              <w:right w:val="single" w:sz="4" w:space="0" w:color="000000"/>
+            </w:tcBorders>
           </w:tcPr>
           <w:p>
             <w:pPr>
-              <w:spacing w:before="20" w:after="20" w:line="276" w:lineRule="auto"/>
+              <w:spacing w:line="276" w:lineRule="auto" w:before="40" w:after="40"/>
               <w:jc w:val="left"/>
             </w:pPr>
             <w:r>
               <w:rPr>
                 <w:rFonts w:ascii="Times New Roman" w:hAnsi="Times New Roman"/>
-                <w:b/>
                 <w:sz w:val="22"/>
               </w:rPr>
               <w:t>4.</w:t>
@@ -1419,36 +1505,66 @@
         </w:tc>
         <w:tc>
           <w:tcPr>
-            <w:tcW w:type="dxa" w:w="4995"/>
+            <w:tcW w:w="4995" w:type="dxa"/>
+            <w:tcBorders>
+              <w:top w:val="single" w:sz="4" w:space="0" w:color="000000"/>
+              <w:left w:val="single" w:sz="4" w:space="0" w:color="000000"/>
+              <w:bottom w:val="single" w:sz="4" w:space="0" w:color="000000"/>
+              <w:right w:val="single" w:sz="4" w:space="0" w:color="000000"/>
+            </w:tcBorders>
           </w:tcPr>
           <w:p>
             <w:pPr>
-              <w:spacing w:before="20" w:after="20" w:line="276" w:lineRule="auto"/>
+              <w:spacing w:line="276" w:lineRule="auto" w:before="40" w:after="40"/>
               <w:jc w:val="left"/>
             </w:pPr>
             <w:r>
               <w:rPr>
                 <w:rFonts w:ascii="Times New Roman" w:hAnsi="Times New Roman"/>
-                <w:b/>
                 <w:sz w:val="22"/>
               </w:rPr>
               <w:t>Project Description</w:t>
+              <w:br/>
+              <w:t xml:space="preserve">    4.1 Introduction </w:t>
+              <w:br/>
+              <w:t xml:space="preserve">    4.2 Organization Profile </w:t>
+              <w:br/>
+              <w:t xml:space="preserve">    4.3 Problem Statement </w:t>
+              <w:br/>
+              <w:t xml:space="preserve">    4.4 Project Objectives </w:t>
+              <w:br/>
+              <w:t xml:space="preserve">    4.5 Scope of the Project </w:t>
+              <w:br/>
+              <w:t xml:space="preserve">    4.6 Technologies and Tools Used </w:t>
+              <w:br/>
+              <w:t xml:space="preserve">    4.7 System Architecture </w:t>
+              <w:br/>
+              <w:t xml:space="preserve">    4.8 Methodology </w:t>
+              <w:br/>
+              <w:t xml:space="preserve">    4.9 Expected Outcomes</w:t>
+              <w:br/>
+              <w:t xml:space="preserve">    4.10 Certificates of completion and other communication mail proof must be attached</w:t>
             </w:r>
           </w:p>
         </w:tc>
         <w:tc>
           <w:tcPr>
-            <w:tcW w:type="dxa" w:w="1995"/>
+            <w:tcW w:w="1995" w:type="dxa"/>
+            <w:tcBorders>
+              <w:top w:val="single" w:sz="4" w:space="0" w:color="000000"/>
+              <w:left w:val="single" w:sz="4" w:space="0" w:color="000000"/>
+              <w:bottom w:val="single" w:sz="4" w:space="0" w:color="000000"/>
+              <w:right w:val="single" w:sz="4" w:space="0" w:color="000000"/>
+            </w:tcBorders>
           </w:tcPr>
           <w:p>
             <w:pPr>
-              <w:spacing w:before="20" w:after="20" w:line="276" w:lineRule="auto"/>
+              <w:spacing w:line="276" w:lineRule="auto" w:before="40" w:after="40"/>
               <w:jc w:val="left"/>
             </w:pPr>
             <w:r>
               <w:rPr>
                 <w:rFonts w:ascii="Times New Roman" w:hAnsi="Times New Roman"/>
-                <w:b/>
                 <w:sz w:val="22"/>
               </w:rPr>
               <w:t>1</w:t>
@@ -1457,559 +1573,27 @@
         </w:tc>
       </w:tr>
       <w:tr>
+        <w:trPr>
+          <w:trHeight w:val="278"/>
+        </w:trPr>
         <w:tc>
           <w:tcPr>
-            <w:tcW w:type="dxa" w:w="1455"/>
+            <w:tcW w:w="1455" w:type="dxa"/>
+            <w:tcBorders>
+              <w:top w:val="single" w:sz="4" w:space="0" w:color="000000"/>
+              <w:left w:val="single" w:sz="4" w:space="0" w:color="000000"/>
+              <w:bottom w:val="single" w:sz="4" w:space="0" w:color="000000"/>
+              <w:right w:val="single" w:sz="4" w:space="0" w:color="000000"/>
+            </w:tcBorders>
           </w:tcPr>
           <w:p>
             <w:pPr>
-              <w:spacing w:before="20" w:after="20" w:line="276" w:lineRule="auto"/>
+              <w:spacing w:line="276" w:lineRule="auto" w:before="40" w:after="40"/>
               <w:jc w:val="left"/>
             </w:pPr>
             <w:r>
               <w:rPr>
                 <w:rFonts w:ascii="Times New Roman" w:hAnsi="Times New Roman"/>
-                <w:sz w:val="22"/>
-              </w:rPr>
-            </w:r>
-          </w:p>
-        </w:tc>
-        <w:tc>
-          <w:tcPr>
-            <w:tcW w:type="dxa" w:w="4995"/>
-          </w:tcPr>
-          <w:p>
-            <w:pPr>
-              <w:spacing w:before="20" w:after="20" w:line="276" w:lineRule="auto"/>
-              <w:jc w:val="left"/>
-            </w:pPr>
-            <w:r>
-              <w:rPr>
-                <w:rFonts w:ascii="Times New Roman" w:hAnsi="Times New Roman"/>
-                <w:sz w:val="22"/>
-              </w:rPr>
-              <w:t xml:space="preserve">    4.1 Introduction</w:t>
-            </w:r>
-          </w:p>
-        </w:tc>
-        <w:tc>
-          <w:tcPr>
-            <w:tcW w:type="dxa" w:w="1995"/>
-          </w:tcPr>
-          <w:p>
-            <w:pPr>
-              <w:spacing w:before="20" w:after="20" w:line="276" w:lineRule="auto"/>
-              <w:jc w:val="left"/>
-            </w:pPr>
-            <w:r>
-              <w:rPr>
-                <w:rFonts w:ascii="Times New Roman" w:hAnsi="Times New Roman"/>
-                <w:sz w:val="22"/>
-              </w:rPr>
-            </w:r>
-          </w:p>
-        </w:tc>
-      </w:tr>
-      <w:tr>
-        <w:tc>
-          <w:tcPr>
-            <w:tcW w:type="dxa" w:w="1455"/>
-          </w:tcPr>
-          <w:p>
-            <w:pPr>
-              <w:spacing w:before="20" w:after="20" w:line="276" w:lineRule="auto"/>
-              <w:jc w:val="left"/>
-            </w:pPr>
-            <w:r>
-              <w:rPr>
-                <w:rFonts w:ascii="Times New Roman" w:hAnsi="Times New Roman"/>
-                <w:sz w:val="22"/>
-              </w:rPr>
-            </w:r>
-          </w:p>
-        </w:tc>
-        <w:tc>
-          <w:tcPr>
-            <w:tcW w:type="dxa" w:w="4995"/>
-          </w:tcPr>
-          <w:p>
-            <w:pPr>
-              <w:spacing w:before="20" w:after="20" w:line="276" w:lineRule="auto"/>
-              <w:jc w:val="left"/>
-            </w:pPr>
-            <w:r>
-              <w:rPr>
-                <w:rFonts w:ascii="Times New Roman" w:hAnsi="Times New Roman"/>
-                <w:sz w:val="22"/>
-              </w:rPr>
-              <w:t xml:space="preserve">    4.2 Organization Profile</w:t>
-            </w:r>
-          </w:p>
-        </w:tc>
-        <w:tc>
-          <w:tcPr>
-            <w:tcW w:type="dxa" w:w="1995"/>
-          </w:tcPr>
-          <w:p>
-            <w:pPr>
-              <w:spacing w:before="20" w:after="20" w:line="276" w:lineRule="auto"/>
-              <w:jc w:val="left"/>
-            </w:pPr>
-            <w:r>
-              <w:rPr>
-                <w:rFonts w:ascii="Times New Roman" w:hAnsi="Times New Roman"/>
-                <w:sz w:val="22"/>
-              </w:rPr>
-            </w:r>
-          </w:p>
-        </w:tc>
-      </w:tr>
-      <w:tr>
-        <w:tc>
-          <w:tcPr>
-            <w:tcW w:type="dxa" w:w="1455"/>
-          </w:tcPr>
-          <w:p>
-            <w:pPr>
-              <w:spacing w:before="20" w:after="20" w:line="276" w:lineRule="auto"/>
-              <w:jc w:val="left"/>
-            </w:pPr>
-            <w:r>
-              <w:rPr>
-                <w:rFonts w:ascii="Times New Roman" w:hAnsi="Times New Roman"/>
-                <w:sz w:val="22"/>
-              </w:rPr>
-            </w:r>
-          </w:p>
-        </w:tc>
-        <w:tc>
-          <w:tcPr>
-            <w:tcW w:type="dxa" w:w="4995"/>
-          </w:tcPr>
-          <w:p>
-            <w:pPr>
-              <w:spacing w:before="20" w:after="20" w:line="276" w:lineRule="auto"/>
-              <w:jc w:val="left"/>
-            </w:pPr>
-            <w:r>
-              <w:rPr>
-                <w:rFonts w:ascii="Times New Roman" w:hAnsi="Times New Roman"/>
-                <w:sz w:val="22"/>
-              </w:rPr>
-              <w:t xml:space="preserve">    4.3 Problem Statement</w:t>
-            </w:r>
-          </w:p>
-        </w:tc>
-        <w:tc>
-          <w:tcPr>
-            <w:tcW w:type="dxa" w:w="1995"/>
-          </w:tcPr>
-          <w:p>
-            <w:pPr>
-              <w:spacing w:before="20" w:after="20" w:line="276" w:lineRule="auto"/>
-              <w:jc w:val="left"/>
-            </w:pPr>
-            <w:r>
-              <w:rPr>
-                <w:rFonts w:ascii="Times New Roman" w:hAnsi="Times New Roman"/>
-                <w:sz w:val="22"/>
-              </w:rPr>
-            </w:r>
-          </w:p>
-        </w:tc>
-      </w:tr>
-      <w:tr>
-        <w:tc>
-          <w:tcPr>
-            <w:tcW w:type="dxa" w:w="1455"/>
-          </w:tcPr>
-          <w:p>
-            <w:pPr>
-              <w:spacing w:before="20" w:after="20" w:line="276" w:lineRule="auto"/>
-              <w:jc w:val="left"/>
-            </w:pPr>
-            <w:r>
-              <w:rPr>
-                <w:rFonts w:ascii="Times New Roman" w:hAnsi="Times New Roman"/>
-                <w:sz w:val="22"/>
-              </w:rPr>
-            </w:r>
-          </w:p>
-        </w:tc>
-        <w:tc>
-          <w:tcPr>
-            <w:tcW w:type="dxa" w:w="4995"/>
-          </w:tcPr>
-          <w:p>
-            <w:pPr>
-              <w:spacing w:before="20" w:after="20" w:line="276" w:lineRule="auto"/>
-              <w:jc w:val="left"/>
-            </w:pPr>
-            <w:r>
-              <w:rPr>
-                <w:rFonts w:ascii="Times New Roman" w:hAnsi="Times New Roman"/>
-                <w:sz w:val="22"/>
-              </w:rPr>
-              <w:t xml:space="preserve">    4.4 Project Objectives</w:t>
-            </w:r>
-          </w:p>
-        </w:tc>
-        <w:tc>
-          <w:tcPr>
-            <w:tcW w:type="dxa" w:w="1995"/>
-          </w:tcPr>
-          <w:p>
-            <w:pPr>
-              <w:spacing w:before="20" w:after="20" w:line="276" w:lineRule="auto"/>
-              <w:jc w:val="left"/>
-            </w:pPr>
-            <w:r>
-              <w:rPr>
-                <w:rFonts w:ascii="Times New Roman" w:hAnsi="Times New Roman"/>
-                <w:sz w:val="22"/>
-              </w:rPr>
-            </w:r>
-          </w:p>
-        </w:tc>
-      </w:tr>
-      <w:tr>
-        <w:tc>
-          <w:tcPr>
-            <w:tcW w:type="dxa" w:w="1455"/>
-          </w:tcPr>
-          <w:p>
-            <w:pPr>
-              <w:spacing w:before="20" w:after="20" w:line="276" w:lineRule="auto"/>
-              <w:jc w:val="left"/>
-            </w:pPr>
-            <w:r>
-              <w:rPr>
-                <w:rFonts w:ascii="Times New Roman" w:hAnsi="Times New Roman"/>
-                <w:sz w:val="22"/>
-              </w:rPr>
-            </w:r>
-          </w:p>
-        </w:tc>
-        <w:tc>
-          <w:tcPr>
-            <w:tcW w:type="dxa" w:w="4995"/>
-          </w:tcPr>
-          <w:p>
-            <w:pPr>
-              <w:spacing w:before="20" w:after="20" w:line="276" w:lineRule="auto"/>
-              <w:jc w:val="left"/>
-            </w:pPr>
-            <w:r>
-              <w:rPr>
-                <w:rFonts w:ascii="Times New Roman" w:hAnsi="Times New Roman"/>
-                <w:sz w:val="22"/>
-              </w:rPr>
-              <w:t xml:space="preserve">    4.5 Scope of the Project</w:t>
-            </w:r>
-          </w:p>
-        </w:tc>
-        <w:tc>
-          <w:tcPr>
-            <w:tcW w:type="dxa" w:w="1995"/>
-          </w:tcPr>
-          <w:p>
-            <w:pPr>
-              <w:spacing w:before="20" w:after="20" w:line="276" w:lineRule="auto"/>
-              <w:jc w:val="left"/>
-            </w:pPr>
-            <w:r>
-              <w:rPr>
-                <w:rFonts w:ascii="Times New Roman" w:hAnsi="Times New Roman"/>
-                <w:sz w:val="22"/>
-              </w:rPr>
-            </w:r>
-          </w:p>
-        </w:tc>
-      </w:tr>
-      <w:tr>
-        <w:tc>
-          <w:tcPr>
-            <w:tcW w:type="dxa" w:w="1455"/>
-          </w:tcPr>
-          <w:p>
-            <w:pPr>
-              <w:spacing w:before="20" w:after="20" w:line="276" w:lineRule="auto"/>
-              <w:jc w:val="left"/>
-            </w:pPr>
-            <w:r>
-              <w:rPr>
-                <w:rFonts w:ascii="Times New Roman" w:hAnsi="Times New Roman"/>
-                <w:sz w:val="22"/>
-              </w:rPr>
-            </w:r>
-          </w:p>
-        </w:tc>
-        <w:tc>
-          <w:tcPr>
-            <w:tcW w:type="dxa" w:w="4995"/>
-          </w:tcPr>
-          <w:p>
-            <w:pPr>
-              <w:spacing w:before="20" w:after="20" w:line="276" w:lineRule="auto"/>
-              <w:jc w:val="left"/>
-            </w:pPr>
-            <w:r>
-              <w:rPr>
-                <w:rFonts w:ascii="Times New Roman" w:hAnsi="Times New Roman"/>
-                <w:sz w:val="22"/>
-              </w:rPr>
-              <w:t xml:space="preserve">    4.6 Technologies and Tools Used</w:t>
-            </w:r>
-          </w:p>
-        </w:tc>
-        <w:tc>
-          <w:tcPr>
-            <w:tcW w:type="dxa" w:w="1995"/>
-          </w:tcPr>
-          <w:p>
-            <w:pPr>
-              <w:spacing w:before="20" w:after="20" w:line="276" w:lineRule="auto"/>
-              <w:jc w:val="left"/>
-            </w:pPr>
-            <w:r>
-              <w:rPr>
-                <w:rFonts w:ascii="Times New Roman" w:hAnsi="Times New Roman"/>
-                <w:sz w:val="22"/>
-              </w:rPr>
-            </w:r>
-          </w:p>
-        </w:tc>
-      </w:tr>
-      <w:tr>
-        <w:tc>
-          <w:tcPr>
-            <w:tcW w:type="dxa" w:w="1455"/>
-          </w:tcPr>
-          <w:p>
-            <w:pPr>
-              <w:spacing w:before="20" w:after="20" w:line="276" w:lineRule="auto"/>
-              <w:jc w:val="left"/>
-            </w:pPr>
-            <w:r>
-              <w:rPr>
-                <w:rFonts w:ascii="Times New Roman" w:hAnsi="Times New Roman"/>
-                <w:sz w:val="22"/>
-              </w:rPr>
-            </w:r>
-          </w:p>
-        </w:tc>
-        <w:tc>
-          <w:tcPr>
-            <w:tcW w:type="dxa" w:w="4995"/>
-          </w:tcPr>
-          <w:p>
-            <w:pPr>
-              <w:spacing w:before="20" w:after="20" w:line="276" w:lineRule="auto"/>
-              <w:jc w:val="left"/>
-            </w:pPr>
-            <w:r>
-              <w:rPr>
-                <w:rFonts w:ascii="Times New Roman" w:hAnsi="Times New Roman"/>
-                <w:sz w:val="22"/>
-              </w:rPr>
-              <w:t xml:space="preserve">    4.7 System Architecture</w:t>
-            </w:r>
-          </w:p>
-        </w:tc>
-        <w:tc>
-          <w:tcPr>
-            <w:tcW w:type="dxa" w:w="1995"/>
-          </w:tcPr>
-          <w:p>
-            <w:pPr>
-              <w:spacing w:before="20" w:after="20" w:line="276" w:lineRule="auto"/>
-              <w:jc w:val="left"/>
-            </w:pPr>
-            <w:r>
-              <w:rPr>
-                <w:rFonts w:ascii="Times New Roman" w:hAnsi="Times New Roman"/>
-                <w:sz w:val="22"/>
-              </w:rPr>
-            </w:r>
-          </w:p>
-        </w:tc>
-      </w:tr>
-      <w:tr>
-        <w:tc>
-          <w:tcPr>
-            <w:tcW w:type="dxa" w:w="1455"/>
-          </w:tcPr>
-          <w:p>
-            <w:pPr>
-              <w:spacing w:before="20" w:after="20" w:line="276" w:lineRule="auto"/>
-              <w:jc w:val="left"/>
-            </w:pPr>
-            <w:r>
-              <w:rPr>
-                <w:rFonts w:ascii="Times New Roman" w:hAnsi="Times New Roman"/>
-                <w:sz w:val="22"/>
-              </w:rPr>
-            </w:r>
-          </w:p>
-        </w:tc>
-        <w:tc>
-          <w:tcPr>
-            <w:tcW w:type="dxa" w:w="4995"/>
-          </w:tcPr>
-          <w:p>
-            <w:pPr>
-              <w:spacing w:before="20" w:after="20" w:line="276" w:lineRule="auto"/>
-              <w:jc w:val="left"/>
-            </w:pPr>
-            <w:r>
-              <w:rPr>
-                <w:rFonts w:ascii="Times New Roman" w:hAnsi="Times New Roman"/>
-                <w:sz w:val="22"/>
-              </w:rPr>
-              <w:t xml:space="preserve">    4.8 Methodology</w:t>
-            </w:r>
-          </w:p>
-        </w:tc>
-        <w:tc>
-          <w:tcPr>
-            <w:tcW w:type="dxa" w:w="1995"/>
-          </w:tcPr>
-          <w:p>
-            <w:pPr>
-              <w:spacing w:before="20" w:after="20" w:line="276" w:lineRule="auto"/>
-              <w:jc w:val="left"/>
-            </w:pPr>
-            <w:r>
-              <w:rPr>
-                <w:rFonts w:ascii="Times New Roman" w:hAnsi="Times New Roman"/>
-                <w:sz w:val="22"/>
-              </w:rPr>
-            </w:r>
-          </w:p>
-        </w:tc>
-      </w:tr>
-      <w:tr>
-        <w:tc>
-          <w:tcPr>
-            <w:tcW w:type="dxa" w:w="1455"/>
-          </w:tcPr>
-          <w:p>
-            <w:pPr>
-              <w:spacing w:before="20" w:after="20" w:line="276" w:lineRule="auto"/>
-              <w:jc w:val="left"/>
-            </w:pPr>
-            <w:r>
-              <w:rPr>
-                <w:rFonts w:ascii="Times New Roman" w:hAnsi="Times New Roman"/>
-                <w:sz w:val="22"/>
-              </w:rPr>
-            </w:r>
-          </w:p>
-        </w:tc>
-        <w:tc>
-          <w:tcPr>
-            <w:tcW w:type="dxa" w:w="4995"/>
-          </w:tcPr>
-          <w:p>
-            <w:pPr>
-              <w:spacing w:before="20" w:after="20" w:line="276" w:lineRule="auto"/>
-              <w:jc w:val="left"/>
-            </w:pPr>
-            <w:r>
-              <w:rPr>
-                <w:rFonts w:ascii="Times New Roman" w:hAnsi="Times New Roman"/>
-                <w:sz w:val="22"/>
-              </w:rPr>
-              <w:t xml:space="preserve">    4.9 Expected Outcomes</w:t>
-            </w:r>
-          </w:p>
-        </w:tc>
-        <w:tc>
-          <w:tcPr>
-            <w:tcW w:type="dxa" w:w="1995"/>
-          </w:tcPr>
-          <w:p>
-            <w:pPr>
-              <w:spacing w:before="20" w:after="20" w:line="276" w:lineRule="auto"/>
-              <w:jc w:val="left"/>
-            </w:pPr>
-            <w:r>
-              <w:rPr>
-                <w:rFonts w:ascii="Times New Roman" w:hAnsi="Times New Roman"/>
-                <w:sz w:val="22"/>
-              </w:rPr>
-            </w:r>
-          </w:p>
-        </w:tc>
-      </w:tr>
-      <w:tr>
-        <w:tc>
-          <w:tcPr>
-            <w:tcW w:type="dxa" w:w="1455"/>
-          </w:tcPr>
-          <w:p>
-            <w:pPr>
-              <w:spacing w:before="20" w:after="20" w:line="276" w:lineRule="auto"/>
-              <w:jc w:val="left"/>
-            </w:pPr>
-            <w:r>
-              <w:rPr>
-                <w:rFonts w:ascii="Times New Roman" w:hAnsi="Times New Roman"/>
-                <w:sz w:val="22"/>
-              </w:rPr>
-            </w:r>
-          </w:p>
-        </w:tc>
-        <w:tc>
-          <w:tcPr>
-            <w:tcW w:type="dxa" w:w="4995"/>
-          </w:tcPr>
-          <w:p>
-            <w:pPr>
-              <w:spacing w:before="20" w:after="20" w:line="276" w:lineRule="auto"/>
-              <w:jc w:val="left"/>
-            </w:pPr>
-            <w:r>
-              <w:rPr>
-                <w:rFonts w:ascii="Times New Roman" w:hAnsi="Times New Roman"/>
-                <w:sz w:val="22"/>
-              </w:rPr>
-              <w:t xml:space="preserve">    4.10 Certificates of Completion &amp; Communication Proof</w:t>
-            </w:r>
-          </w:p>
-        </w:tc>
-        <w:tc>
-          <w:tcPr>
-            <w:tcW w:type="dxa" w:w="1995"/>
-          </w:tcPr>
-          <w:p>
-            <w:pPr>
-              <w:spacing w:before="20" w:after="20" w:line="276" w:lineRule="auto"/>
-              <w:jc w:val="left"/>
-            </w:pPr>
-            <w:r>
-              <w:rPr>
-                <w:rFonts w:ascii="Times New Roman" w:hAnsi="Times New Roman"/>
-                <w:sz w:val="22"/>
-              </w:rPr>
-            </w:r>
-          </w:p>
-        </w:tc>
-      </w:tr>
-      <w:tr>
-        <w:tc>
-          <w:tcPr>
-            <w:tcW w:type="dxa" w:w="1455"/>
-          </w:tcPr>
-          <w:p>
-            <w:pPr>
-              <w:spacing w:before="20" w:after="20" w:line="276" w:lineRule="auto"/>
-              <w:jc w:val="left"/>
-            </w:pPr>
-            <w:r>
-              <w:rPr>
-                <w:rFonts w:ascii="Times New Roman" w:hAnsi="Times New Roman"/>
-                <w:b/>
                 <w:sz w:val="22"/>
               </w:rPr>
               <w:t>5.</w:t>
@@ -2018,17 +1602,22 @@
         </w:tc>
         <w:tc>
           <w:tcPr>
-            <w:tcW w:type="dxa" w:w="4995"/>
+            <w:tcW w:w="4995" w:type="dxa"/>
+            <w:tcBorders>
+              <w:top w:val="single" w:sz="4" w:space="0" w:color="000000"/>
+              <w:left w:val="single" w:sz="4" w:space="0" w:color="000000"/>
+              <w:bottom w:val="single" w:sz="4" w:space="0" w:color="000000"/>
+              <w:right w:val="single" w:sz="4" w:space="0" w:color="000000"/>
+            </w:tcBorders>
           </w:tcPr>
           <w:p>
             <w:pPr>
-              <w:spacing w:before="20" w:after="20" w:line="276" w:lineRule="auto"/>
+              <w:spacing w:line="276" w:lineRule="auto" w:before="40" w:after="40"/>
               <w:jc w:val="left"/>
             </w:pPr>
             <w:r>
               <w:rPr>
                 <w:rFonts w:ascii="Times New Roman" w:hAnsi="Times New Roman"/>
-                <w:b/>
                 <w:sz w:val="22"/>
               </w:rPr>
               <w:t>Bibliography / References</w:t>
@@ -2037,17 +1626,22 @@
         </w:tc>
         <w:tc>
           <w:tcPr>
-            <w:tcW w:type="dxa" w:w="1995"/>
+            <w:tcW w:w="1995" w:type="dxa"/>
+            <w:tcBorders>
+              <w:top w:val="single" w:sz="4" w:space="0" w:color="000000"/>
+              <w:left w:val="single" w:sz="4" w:space="0" w:color="000000"/>
+              <w:bottom w:val="single" w:sz="4" w:space="0" w:color="000000"/>
+              <w:right w:val="single" w:sz="4" w:space="0" w:color="000000"/>
+            </w:tcBorders>
           </w:tcPr>
           <w:p>
             <w:pPr>
-              <w:spacing w:before="20" w:after="20" w:line="276" w:lineRule="auto"/>
+              <w:spacing w:line="276" w:lineRule="auto" w:before="40" w:after="40"/>
               <w:jc w:val="left"/>
             </w:pPr>
             <w:r>
               <w:rPr>
                 <w:rFonts w:ascii="Times New Roman" w:hAnsi="Times New Roman"/>
-                <w:b/>
                 <w:sz w:val="22"/>
               </w:rPr>
               <w:t>14</w:t>

</xml_diff>

<commit_message>
Fix Cover Page student details alignment to center
</commit_message>
<xml_diff>
--- a/Internship_Report.docx
+++ b/Internship_Report.docx
@@ -170,7 +170,7 @@
           <w:b/>
           <w:sz w:val="26"/>
         </w:rPr>
-        <w:t xml:space="preserve">         B.Tech CSE (Specialization: Cloud Computing) </w:t>
+        <w:t>B.Tech CSE (Specialization: Cloud Computing)</w:t>
       </w:r>
     </w:p>
     <w:p>
@@ -264,6 +264,7 @@
       <w:pPr>
         <w:spacing w:after="147" w:line="259" w:lineRule="auto"/>
         <w:ind w:left="12" w:right="7"/>
+        <w:jc w:val="center"/>
       </w:pPr>
       <w:r>
         <w:rPr>
@@ -271,7 +272,7 @@
           <w:b/>
           <w:sz w:val="24"/>
         </w:rPr>
-        <w:t xml:space="preserve">                                                 Roll Number of Student: CS-2341492</w:t>
+        <w:t>Roll Number of Student: CS-2341492</w:t>
       </w:r>
     </w:p>
     <w:p>
@@ -293,6 +294,7 @@
       <w:pPr>
         <w:spacing w:after="147" w:line="259" w:lineRule="auto"/>
         <w:ind w:left="12" w:right="0"/>
+        <w:jc w:val="center"/>
       </w:pPr>
       <w:r>
         <w:rPr>
@@ -300,7 +302,7 @@
           <w:b/>
           <w:sz w:val="24"/>
         </w:rPr>
-        <w:t xml:space="preserve">                                                                  Batch: 2026-27 (Section: 4CSE8)</w:t>
+        <w:t>Batch: 2026-27 (Section: 4CSE8)</w:t>
       </w:r>
     </w:p>
     <w:p>
@@ -343,9 +345,7 @@
         <w:ind w:left="53" w:right="0"/>
         <w:jc w:val="center"/>
       </w:pPr>
-      <w:r>
-        <w:t>2026-27</w:t>
-      </w:r>
+      <w:r/>
     </w:p>
     <w:p>
       <w:pPr>

</xml_diff>

<commit_message>
Replace placeholder with official SystemaOps Certificate of Recognition (ID: 041332028552)
</commit_message>
<xml_diff>
--- a/Internship_Report.docx
+++ b/Internship_Report.docx
@@ -1695,12 +1695,12 @@
           <w:color w:val="000000"/>
           <w:sz w:val="24"/>
         </w:rPr>
-        <w:t>3.1 SystemaOps Internship Completion Certificate</w:t>
-      </w:r>
-    </w:p>
-    <w:p>
-      <w:pPr>
-        <w:spacing w:before="0" w:after="360" w:line="360" w:lineRule="auto"/>
+        <w:t>3.1 Official SystemaOps Certificate of Recognition</w:t>
+      </w:r>
+    </w:p>
+    <w:p>
+      <w:pPr>
+        <w:spacing w:before="0" w:after="240" w:line="360" w:lineRule="auto"/>
         <w:jc w:val="both"/>
       </w:pPr>
       <w:r>
@@ -1711,58 +1711,47 @@
           <w:color w:val="000000"/>
           <w:sz w:val="24"/>
         </w:rPr>
-        <w:t>This is to certify that Pawan Dubey (Roll No: CS-2341492), a student of B.Tech Computer Science &amp; Engineering (Specialization: Cloud Computing, Section: 4CSE8) at IILM University, Greater Noida, has successfully completed a 3-Month Summer Internship at SystemaOps (systemaops.com) from June 2026 to August 2026.</w:t>
-        <w:br/>
-        <w:br/>
-        <w:t>During this internship tenure, the candidate served as a Cloud &amp; DevOps Engineering Intern (Company Email: pawan.dubey@systemaops.in) and demonstrated exceptional performance in automated AWS cloud provisioning using HashiCorp Terraform, multi-container microservice orchestration with Docker &amp; Kubernetes, CI/CD pipeline automation using Jenkins &amp; GitHub Actions, and observability dashboard setup with Prometheus &amp; Grafana.</w:t>
-      </w:r>
-    </w:p>
-    <w:p>
-      <w:pPr>
-        <w:spacing w:before="0" w:after="80" w:line="360" w:lineRule="auto"/>
-        <w:jc w:val="right"/>
-      </w:pPr>
-      <w:r>
-        <w:rPr>
-          <w:rFonts w:ascii="Times New Roman" w:hAnsi="Times New Roman"/>
-          <w:b w:val="0"/>
-          <w:i w:val="0"/>
-          <w:color w:val="000000"/>
-          <w:sz w:val="24"/>
-        </w:rPr>
-        <w:t>Authorized Signatory: ______________________</w:t>
-      </w:r>
-    </w:p>
-    <w:p>
-      <w:pPr>
-        <w:spacing w:before="0" w:after="40" w:line="360" w:lineRule="auto"/>
-        <w:jc w:val="right"/>
-      </w:pPr>
-      <w:r>
-        <w:rPr>
-          <w:rFonts w:ascii="Times New Roman" w:hAnsi="Times New Roman"/>
-          <w:b/>
-          <w:i w:val="0"/>
-          <w:color w:val="000000"/>
-          <w:sz w:val="24"/>
-        </w:rPr>
-        <w:t>SystemaOps Engineering Team (systemaops.com)</w:t>
-      </w:r>
-    </w:p>
-    <w:p>
-      <w:pPr>
-        <w:spacing w:before="0" w:after="480" w:line="360" w:lineRule="auto"/>
-        <w:jc w:val="right"/>
-      </w:pPr>
-      <w:r>
-        <w:rPr>
-          <w:rFonts w:ascii="Times New Roman" w:hAnsi="Times New Roman"/>
-          <w:b w:val="0"/>
-          <w:i/>
-          <w:color w:val="000000"/>
-          <w:sz w:val="24"/>
-        </w:rPr>
-        <w:t>Contact Email: pawan.dubey@systemaops.in</w:t>
+        <w:t>This is to certify that Pawan Dubey (Roll No: CS-2341492, Employee ID: 041332028552), a student of B.Tech Computer Science &amp; Engineering (Specialization: Cloud Computing, Section: 4CSE8) at IILM University, Greater Noida, has successfully completed a 3-Month Summer Internship as a Cloud &amp; DevOps Engineering Intern at SystemaOps. The certificate of recognition was awarded on 17-08-2026, signed by Rohit Thumu (Authorized Signatory) and Jhansi (HR Department).</w:t>
+      </w:r>
+    </w:p>
+    <w:p>
+      <w:pPr>
+        <w:spacing w:before="120" w:after="360"/>
+        <w:jc w:val="center"/>
+      </w:pPr>
+      <w:r>
+        <w:drawing>
+          <wp:inline xmlns:a="http://schemas.openxmlformats.org/drawingml/2006/main" xmlns:pic="http://schemas.openxmlformats.org/drawingml/2006/picture">
+            <wp:extent cx="5303520" cy="3750994"/>
+            <wp:docPr id="2" name="Picture 2"/>
+            <wp:cNvGraphicFramePr>
+              <a:graphicFrameLocks noChangeAspect="1"/>
+            </wp:cNvGraphicFramePr>
+            <a:graphic>
+              <a:graphicData uri="http://schemas.openxmlformats.org/drawingml/2006/picture">
+                <pic:pic>
+                  <pic:nvPicPr>
+                    <pic:cNvPr id="0" name="Internship_Completion_Certificate.png"/>
+                    <pic:cNvPicPr/>
+                  </pic:nvPicPr>
+                  <pic:blipFill>
+                    <a:blip r:embed="rId8"/>
+                    <a:stretch>
+                      <a:fillRect/>
+                    </a:stretch>
+                  </pic:blipFill>
+                  <pic:spPr>
+                    <a:xfrm>
+                      <a:off x="0" y="0"/>
+                      <a:ext cx="5303520" cy="3750994"/>
+                    </a:xfrm>
+                    <a:prstGeom prst="rect"/>
+                  </pic:spPr>
+                </pic:pic>
+              </a:graphicData>
+            </a:graphic>
+          </wp:inline>
+        </w:drawing>
       </w:r>
     </w:p>
     <w:p>
@@ -1811,7 +1800,7 @@
         <w:drawing>
           <wp:inline xmlns:a="http://schemas.openxmlformats.org/drawingml/2006/main" xmlns:pic="http://schemas.openxmlformats.org/drawingml/2006/picture">
             <wp:extent cx="4937760" cy="5927627"/>
-            <wp:docPr id="2" name="Picture 2"/>
+            <wp:docPr id="3" name="Picture 3"/>
             <wp:cNvGraphicFramePr>
               <a:graphicFrameLocks noChangeAspect="1"/>
             </wp:cNvGraphicFramePr>
@@ -1823,7 +1812,7 @@
                     <pic:cNvPicPr/>
                   </pic:nvPicPr>
                   <pic:blipFill>
-                    <a:blip r:embed="rId8"/>
+                    <a:blip r:embed="rId9"/>
                     <a:stretch>
                       <a:fillRect/>
                     </a:stretch>
@@ -1888,7 +1877,7 @@
         <w:drawing>
           <wp:inline xmlns:a="http://schemas.openxmlformats.org/drawingml/2006/main" xmlns:pic="http://schemas.openxmlformats.org/drawingml/2006/picture">
             <wp:extent cx="4937760" cy="6390042"/>
-            <wp:docPr id="3" name="Picture 3"/>
+            <wp:docPr id="4" name="Picture 4"/>
             <wp:cNvGraphicFramePr>
               <a:graphicFrameLocks noChangeAspect="1"/>
             </wp:cNvGraphicFramePr>
@@ -1900,7 +1889,7 @@
                     <pic:cNvPicPr/>
                   </pic:nvPicPr>
                   <pic:blipFill>
-                    <a:blip r:embed="rId9"/>
+                    <a:blip r:embed="rId10"/>
                     <a:stretch>
                       <a:fillRect/>
                     </a:stretch>
@@ -3114,7 +3103,7 @@
           <w:color w:val="000000"/>
           <w:sz w:val="24"/>
         </w:rPr>
-        <w:t>Official proof of completion including the internship completion certificate issued by SystemaOps (systemaops.com), SystemaOps Internship Offer Letter signed by Rohit Thumu (CEO), IILM University No Objection Certificate (NOC) issued by Dr. Amit Agarwal (Asst. Dean, SCSE), performance evaluation feedback, and official university/company communication email records have been verified and annexed. The public GitHub repository contains all code artifacts, Terraform scripts, Dockerfiles, Kubernetes manifests, report documentation, and presentation PDF.</w:t>
+        <w:t>Official proof of completion including the official SystemaOps Certificate of Recognition (Employee ID: 041332028552, awarded 17-08-2026), SystemaOps Internship Offer Letter signed by Rohit Thumu (CEO), IILM University No Objection Certificate (NOC) issued by Dr. Amit Agarwal (Asst. Dean, SCSE), performance evaluation feedback, and official university/company communication email records have been verified and annexed. The public GitHub repository contains all code artifacts, Terraform scripts, Dockerfiles, Kubernetes manifests, report documentation, and presentation PDF.</w:t>
       </w:r>
     </w:p>
     <w:p>

</xml_diff>